<commit_message>
Remove rotas legadas e código morto; sincroniza documentação.
Auditoria técnica (etapas 1–3): elimina módulos sem uso, exports @deprecated e stub mode=destaques; redireciona /admin/lugares e /admin/destaques para /admin/locais; poda homeContext; alinha docs, checklist e geradores de contrato ao estado atual do app.

Co-authored-by: Cursor <cursoragent@cursor.com>
</commit_message>
<xml_diff>
--- a/docs/contratos/MODELO-CONTRATO-PARCEIRO-6-MESES-GRATIS.docx
+++ b/docs/contratos/MODELO-CONTRATO-PARCEIRO-6-MESES-GRATIS.docx
@@ -4,7 +4,7 @@
   <w:body>
     <w:p>
       <w:pPr>
-        <w:spacing w:after="600" w:before="0"/>
+        <w:spacing w:after="800" w:before="0"/>
       </w:pPr>
     </w:p>
     <w:p>
@@ -56,6 +56,127 @@
     </w:p>
     <w:p>
       <w:pPr>
+        <w:spacing w:after="480"/>
+        <w:jc w:val="center"/>
+      </w:pPr>
+      <w:r>
+        <w:rPr>
+          <w:rFonts w:ascii="Arial" w:cs="Arial" w:eastAsia="Arial" w:hAnsi="Arial"/>
+          <w:i/>
+          <w:iCs/>
+          <w:color w:val="5A6B66"/>
+          <w:sz w:val="22"/>
+          <w:szCs w:val="22"/>
+        </w:rPr>
+        <w:t xml:space="preserve">Versão 1.0 · 2026</w:t>
+      </w:r>
+    </w:p>
+    <w:p>
+      <w:pPr>
+        <w:spacing w:after="160"/>
+        <w:jc w:val="center"/>
+      </w:pPr>
+      <w:r>
+        <w:rPr>
+          <w:rFonts w:ascii="Arial" w:cs="Arial" w:eastAsia="Arial" w:hAnsi="Arial"/>
+          <w:color w:val="5A6B66"/>
+          <w:sz w:val="24"/>
+          <w:szCs w:val="24"/>
+        </w:rPr>
+        <w:t xml:space="preserve">Proposta nº </w:t>
+      </w:r>
+      <w:r>
+        <w:rPr>
+          <w:rFonts w:ascii="Arial" w:cs="Arial" w:eastAsia="Arial" w:hAnsi="Arial"/>
+          <w:color w:val="5A6B66"/>
+          <w:sz w:val="24"/>
+          <w:szCs w:val="24"/>
+          <w:u w:val="single"/>
+        </w:rPr>
+        <w:t xml:space="preserve">___________</w:t>
+      </w:r>
+      <w:r>
+        <w:rPr>
+          <w:rFonts w:ascii="Arial" w:cs="Arial" w:eastAsia="Arial" w:hAnsi="Arial"/>
+          <w:color w:val="5A6B66"/>
+          <w:sz w:val="24"/>
+          <w:szCs w:val="24"/>
+        </w:rPr>
+        <w:t xml:space="preserve"> /2026</w:t>
+      </w:r>
+    </w:p>
+    <w:p>
+      <w:pPr>
+        <w:spacing w:after="120"/>
+        <w:jc w:val="center"/>
+      </w:pPr>
+      <w:r>
+        <w:rPr>
+          <w:rFonts w:ascii="Arial" w:cs="Arial" w:eastAsia="Arial" w:hAnsi="Arial"/>
+          <w:color w:val="5A6B66"/>
+          <w:sz w:val="22"/>
+          <w:szCs w:val="22"/>
+        </w:rPr>
+        <w:t xml:space="preserve">Imbituba, Santa Catarina</w:t>
+      </w:r>
+    </w:p>
+    <w:p>
+      <w:pPr>
+        <w:spacing w:after="200" w:before="0"/>
+      </w:pPr>
+    </w:p>
+    <w:p>
+      <w:pPr>
+        <w:spacing w:after="80"/>
+        <w:jc w:val="center"/>
+      </w:pPr>
+      <w:r>
+        <w:rPr>
+          <w:rFonts w:ascii="Arial" w:cs="Arial" w:eastAsia="Arial" w:hAnsi="Arial"/>
+          <w:color w:val="5A6B66"/>
+          <w:sz w:val="22"/>
+          <w:szCs w:val="22"/>
+        </w:rPr>
+        <w:t xml:space="preserve">Estabelecimento: </w:t>
+      </w:r>
+      <w:r>
+        <w:rPr>
+          <w:rFonts w:ascii="Arial" w:cs="Arial" w:eastAsia="Arial" w:hAnsi="Arial"/>
+          <w:color w:val="5A6B66"/>
+          <w:sz w:val="22"/>
+          <w:szCs w:val="22"/>
+          <w:u w:val="single"/>
+        </w:rPr>
+        <w:t xml:space="preserve">_______________________________________________</w:t>
+      </w:r>
+    </w:p>
+    <w:p>
+      <w:pPr>
+        <w:spacing w:after="80"/>
+        <w:jc w:val="center"/>
+      </w:pPr>
+      <w:r>
+        <w:rPr>
+          <w:rFonts w:ascii="Arial" w:cs="Arial" w:eastAsia="Arial" w:hAnsi="Arial"/>
+          <w:color w:val="5A6B66"/>
+          <w:sz w:val="22"/>
+          <w:szCs w:val="22"/>
+        </w:rPr>
+        <w:t xml:space="preserve">Data: </w:t>
+      </w:r>
+      <w:r>
+        <w:rPr>
+          <w:rFonts w:ascii="Arial" w:cs="Arial" w:eastAsia="Arial" w:hAnsi="Arial"/>
+          <w:color w:val="5A6B66"/>
+          <w:sz w:val="22"/>
+          <w:szCs w:val="22"/>
+          <w:u w:val="single"/>
+        </w:rPr>
+        <w:t xml:space="preserve">____ / ____ / __________</w:t>
+      </w:r>
+    </w:p>
+    <w:p>
+      <w:pPr>
         <w:spacing w:after="400"/>
         <w:jc w:val="center"/>
       </w:pPr>
@@ -65,43 +186,26 @@
           <w:i/>
           <w:iCs/>
           <w:color w:val="5A6B66"/>
-          <w:sz w:val="22"/>
-          <w:szCs w:val="22"/>
-        </w:rPr>
-        <w:t xml:space="preserve">Versão 1.0 · 2026</w:t>
-      </w:r>
-    </w:p>
-    <w:p>
-      <w:pPr>
-        <w:jc w:val="center"/>
-      </w:pPr>
-      <w:r>
-        <w:rPr>
-          <w:rFonts w:ascii="Arial" w:cs="Arial" w:eastAsia="Arial" w:hAnsi="Arial"/>
-          <w:b/>
-          <w:bCs/>
-          <w:color w:val="1A4A3A"/>
-          <w:sz w:val="22"/>
-          <w:szCs w:val="22"/>
-        </w:rPr>
-        <w:t xml:space="preserve">guiadebolso.app · contato@guiadebolso.app</w:t>
-      </w:r>
-    </w:p>
-    <w:p>
-      <w:pPr>
-        <w:spacing w:before="200"/>
-        <w:jc w:val="center"/>
-      </w:pPr>
-      <w:r>
-        <w:rPr>
-          <w:rFonts w:ascii="Arial" w:cs="Arial" w:eastAsia="Arial" w:hAnsi="Arial"/>
-          <w:i/>
-          <w:iCs/>
-          <w:color w:val="5A6B66"/>
           <w:sz w:val="20"/>
           <w:szCs w:val="20"/>
         </w:rPr>
-        <w:t xml:space="preserve">Modelo para impressão e assinatura presencial</w:t>
+        <w:t xml:space="preserve">Validade desta proposta: 30 dias a partir da data acima</w:t>
+      </w:r>
+    </w:p>
+    <w:p>
+      <w:pPr>
+        <w:jc w:val="center"/>
+      </w:pPr>
+      <w:r>
+        <w:rPr>
+          <w:rFonts w:ascii="Arial" w:cs="Arial" w:eastAsia="Arial" w:hAnsi="Arial"/>
+          <w:b/>
+          <w:bCs/>
+          <w:color w:val="1A4A3A"/>
+          <w:sz w:val="22"/>
+          <w:szCs w:val="22"/>
+        </w:rPr>
+        <w:t xml:space="preserve">guiadebolso.app · contato@guiadebolso.app</w:t>
       </w:r>
     </w:p>
     <w:p>
@@ -110,168 +214,42 @@
       </w:r>
     </w:p>
     <w:p>
-      <w:pPr>
-        <w:spacing w:after="140" w:before="0"/>
-      </w:pPr>
-      <w:r>
-        <w:rPr>
-          <w:rFonts w:ascii="Arial" w:cs="Arial" w:eastAsia="Arial" w:hAnsi="Arial"/>
-          <w:b/>
-          <w:bCs/>
-          <w:color w:val="1A2E28"/>
-          <w:sz w:val="22"/>
-          <w:szCs w:val="22"/>
-        </w:rPr>
-        <w:t xml:space="preserve">Proposta nº</w:t>
-      </w:r>
-      <w:r>
-        <w:rPr>
-          <w:rFonts w:ascii="Arial" w:cs="Arial" w:eastAsia="Arial" w:hAnsi="Arial"/>
-          <w:color w:val="5A6B66"/>
-          <w:sz w:val="22"/>
-          <w:szCs w:val="22"/>
-        </w:rPr>
-        <w:t xml:space="preserve"> </w:t>
-      </w:r>
-      <w:r>
-        <w:rPr>
-          <w:rFonts w:ascii="Arial" w:cs="Arial" w:eastAsia="Arial" w:hAnsi="Arial"/>
-          <w:color w:val="5A6B66"/>
-          <w:sz w:val="20"/>
-          <w:szCs w:val="20"/>
-        </w:rPr>
-        <w:t xml:space="preserve">[Nº DA PROPOSTA]</w:t>
-      </w:r>
-      <w:r>
-        <w:rPr>
-          <w:rFonts w:ascii="Arial" w:cs="Arial" w:eastAsia="Arial" w:hAnsi="Arial"/>
-          <w:b/>
-          <w:bCs/>
-          <w:color w:val="1A2E28"/>
-          <w:sz w:val="22"/>
-          <w:szCs w:val="22"/>
-        </w:rPr>
-        <w:t xml:space="preserve">/2026</w:t>
-      </w:r>
-      <w:r>
-        <w:rPr>
-          <w:rFonts w:ascii="Arial" w:cs="Arial" w:eastAsia="Arial" w:hAnsi="Arial"/>
-          <w:color w:val="5A6B66"/>
-          <w:sz w:val="22"/>
-          <w:szCs w:val="22"/>
-        </w:rPr>
-        <w:t xml:space="preserve"> · </w:t>
-      </w:r>
-      <w:r>
-        <w:rPr>
-          <w:rFonts w:ascii="Arial" w:cs="Arial" w:eastAsia="Arial" w:hAnsi="Arial"/>
-          <w:b/>
-          <w:bCs/>
-          <w:color w:val="1A2E28"/>
-          <w:sz w:val="22"/>
-          <w:szCs w:val="22"/>
-        </w:rPr>
-        <w:t xml:space="preserve">Versão do documento:</w:t>
-      </w:r>
-      <w:r>
-        <w:rPr>
-          <w:rFonts w:ascii="Arial" w:cs="Arial" w:eastAsia="Arial" w:hAnsi="Arial"/>
-          <w:color w:val="5A6B66"/>
-          <w:sz w:val="22"/>
-          <w:szCs w:val="22"/>
-        </w:rPr>
-        <w:t xml:space="preserve"> 1.0</w:t>
-      </w:r>
-    </w:p>
-    <w:p>
-      <w:pPr>
-        <w:spacing w:after="140" w:before="0"/>
-      </w:pPr>
-      <w:r>
-        <w:rPr>
-          <w:rFonts w:ascii="Arial" w:cs="Arial" w:eastAsia="Arial" w:hAnsi="Arial"/>
-          <w:b/>
-          <w:bCs/>
-          <w:color w:val="1A2E28"/>
-          <w:sz w:val="22"/>
-          <w:szCs w:val="22"/>
-        </w:rPr>
-        <w:t xml:space="preserve">Documento para impressão e visita presencial</w:t>
-      </w:r>
-    </w:p>
-    <w:p>
-      <w:pPr>
-        <w:shd w:fill="F0F4F3" w:val="clear"/>
-        <w:spacing w:after="160"/>
-        <w:ind w:left="360"/>
-      </w:pPr>
-      <w:r>
-        <w:rPr>
-          <w:rFonts w:ascii="Arial" w:cs="Arial" w:eastAsia="Arial" w:hAnsi="Arial"/>
-          <w:color w:val="5A6B66"/>
-          <w:sz w:val="22"/>
-          <w:szCs w:val="22"/>
-        </w:rPr>
-        <w:t xml:space="preserve">Modelo comercial do programa de lançamento. Após os 6 meses, a continuidade é </w:t>
-      </w:r>
-      <w:r>
-        <w:rPr>
-          <w:rFonts w:ascii="Arial" w:cs="Arial" w:eastAsia="Arial" w:hAnsi="Arial"/>
-          <w:b/>
-          <w:bCs/>
-          <w:color w:val="1A2E28"/>
-          <w:sz w:val="22"/>
-          <w:szCs w:val="22"/>
-        </w:rPr>
-        <w:t xml:space="preserve">opcional</w:t>
-      </w:r>
-      <w:r>
-        <w:rPr>
-          <w:rFonts w:ascii="Arial" w:cs="Arial" w:eastAsia="Arial" w:hAnsi="Arial"/>
-          <w:color w:val="5A6B66"/>
-          <w:sz w:val="22"/>
-          <w:szCs w:val="22"/>
-        </w:rPr>
-        <w:t xml:space="preserve"> pelo Plano Parceiro a </w:t>
-      </w:r>
-      <w:r>
-        <w:rPr>
-          <w:rFonts w:ascii="Arial" w:cs="Arial" w:eastAsia="Arial" w:hAnsi="Arial"/>
-          <w:b/>
-          <w:bCs/>
-          <w:color w:val="1A2E28"/>
-          <w:sz w:val="22"/>
-          <w:szCs w:val="22"/>
-        </w:rPr>
-        <w:t xml:space="preserve">R$ 299,00/mês</w:t>
-      </w:r>
-      <w:r>
-        <w:rPr>
-          <w:rFonts w:ascii="Arial" w:cs="Arial" w:eastAsia="Arial" w:hAnsi="Arial"/>
-          <w:color w:val="5A6B66"/>
-          <w:sz w:val="22"/>
-          <w:szCs w:val="22"/>
-        </w:rPr>
-        <w:t xml:space="preserve"> (contrato pago em </w:t>
-      </w:r>
-      <w:r>
-        <w:rPr>
-          <w:rFonts w:ascii="Arial" w:cs="Arial" w:eastAsia="Arial" w:hAnsi="Arial"/>
+      <w:r>
+        <w:br w:type="page"/>
+      </w:r>
+    </w:p>
+    <w:p>
+      <w:pPr>
+        <w:pStyle w:val="Heading1"/>
+        <w:spacing w:after="200" w:before="280"/>
+      </w:pPr>
+      <w:r>
+        <w:rPr>
+          <w:rFonts w:ascii="Arial" w:cs="Arial" w:eastAsia="Arial" w:hAnsi="Arial"/>
+          <w:b/>
+          <w:bCs/>
           <w:color w:val="1A4A3A"/>
-          <w:sz w:val="22"/>
-          <w:szCs w:val="22"/>
-          <w:u w:val="single"/>
-        </w:rPr>
-        <w:t xml:space="preserve">`MODELO-CONTRATO-PARCEIRO-GUIA-DE-BOLSO.md`</w:t>
-      </w:r>
-      <w:r>
-        <w:rPr>
-          <w:rFonts w:ascii="Arial" w:cs="Arial" w:eastAsia="Arial" w:hAnsi="Arial"/>
-          <w:color w:val="5A6B66"/>
-          <w:sz w:val="22"/>
-          <w:szCs w:val="22"/>
-        </w:rPr>
-        <w:t xml:space="preserve">).</w:t>
+          <w:sz w:val="32"/>
+          <w:szCs w:val="32"/>
+        </w:rPr>
+        <w:t xml:space="preserve">PARTE 1 — PROPOSTA COMERCIAL</w:t>
+      </w:r>
+    </w:p>
+    <w:p>
+      <w:pPr>
+        <w:pStyle w:val="Heading2"/>
+        <w:spacing w:after="140" w:before="240"/>
+      </w:pPr>
+      <w:r>
+        <w:rPr>
+          <w:rFonts w:ascii="Arial" w:cs="Arial" w:eastAsia="Arial" w:hAnsi="Arial"/>
+          <w:b/>
+          <w:bCs/>
+          <w:color w:val="1A4A3A"/>
+          <w:sz w:val="26"/>
+          <w:szCs w:val="26"/>
+        </w:rPr>
+        <w:t xml:space="preserve">Programa de Lançamento — 6 meses grátis</w:t>
       </w:r>
     </w:p>
     <w:p>
@@ -284,9 +262,8 @@
     </w:p>
     <w:p>
       <w:pPr>
-        <w:pStyle w:val="Heading2"/>
-        <w:shd w:fill="F0F4F3" w:val="clear"/>
-        <w:spacing w:after="140" w:before="240"/>
+        <w:pStyle w:val="Heading1"/>
+        <w:spacing w:after="200" w:before="280"/>
       </w:pPr>
       <w:r>
         <w:rPr>
@@ -294,15 +271,16 @@
           <w:b/>
           <w:bCs/>
           <w:color w:val="1A4A3A"/>
-          <w:sz w:val="26"/>
-          <w:szCs w:val="26"/>
-        </w:rPr>
-        <w:t xml:space="preserve">Instruções de impressão</w:t>
-      </w:r>
-    </w:p>
-    <w:p>
-      <w:pPr>
-        <w:spacing w:after="80" w:before="0"/>
+          <w:sz w:val="32"/>
+          <w:szCs w:val="32"/>
+        </w:rPr>
+        <w:t xml:space="preserve">Guia de Bolso</w:t>
+      </w:r>
+    </w:p>
+    <w:p>
+      <w:pPr>
+        <w:pStyle w:val="Heading3"/>
+        <w:spacing w:after="120" w:before="200"/>
       </w:pPr>
       <w:r>
         <w:rPr>
@@ -310,266 +288,87 @@
           <w:b/>
           <w:bCs/>
           <w:color w:val="1A4A3A"/>
-          <w:sz w:val="22"/>
-          <w:szCs w:val="22"/>
-        </w:rPr>
-        <w:t xml:space="preserve">• </w:t>
-      </w:r>
-      <w:r>
-        <w:rPr>
-          <w:rFonts w:ascii="Arial" w:cs="Arial" w:eastAsia="Arial" w:hAnsi="Arial"/>
-          <w:b/>
-          <w:bCs/>
-          <w:color w:val="1A2E28"/>
-          <w:sz w:val="22"/>
-          <w:szCs w:val="22"/>
-        </w:rPr>
-        <w:t xml:space="preserve">Apresentação A4</w:t>
-      </w:r>
-      <w:r>
-        <w:rPr>
-          <w:rFonts w:ascii="Arial" w:cs="Arial" w:eastAsia="Arial" w:hAnsi="Arial"/>
-          <w:color w:val="5A6B66"/>
-          <w:sz w:val="22"/>
-          <w:szCs w:val="22"/>
-        </w:rPr>
-        <w:t xml:space="preserve"> — </w:t>
-      </w:r>
-      <w:r>
-        <w:rPr>
-          <w:rFonts w:ascii="Arial" w:cs="Arial" w:eastAsia="Arial" w:hAnsi="Arial"/>
-          <w:color w:val="1A4A3A"/>
-          <w:sz w:val="22"/>
-          <w:szCs w:val="22"/>
-          <w:u w:val="single"/>
-        </w:rPr>
-        <w:t xml:space="preserve">`docs/materiais/APRESENTACAO-PARCEIRO-A4.html`</w:t>
-      </w:r>
-      <w:r>
-        <w:rPr>
-          <w:rFonts w:ascii="Arial" w:cs="Arial" w:eastAsia="Arial" w:hAnsi="Arial"/>
-          <w:color w:val="5A6B66"/>
-          <w:sz w:val="22"/>
-          <w:szCs w:val="22"/>
-        </w:rPr>
-        <w:t xml:space="preserve"> (edite o HTML antes de imprimir mencionando </w:t>
-      </w:r>
-      <w:r>
-        <w:rPr>
-          <w:rFonts w:ascii="Arial" w:cs="Arial" w:eastAsia="Arial" w:hAnsi="Arial"/>
-          <w:b/>
-          <w:bCs/>
-          <w:color w:val="1A2E28"/>
-          <w:sz w:val="22"/>
-          <w:szCs w:val="22"/>
-        </w:rPr>
-        <w:t xml:space="preserve">6 meses grátis</w:t>
-      </w:r>
-      <w:r>
-        <w:rPr>
-          <w:rFonts w:ascii="Arial" w:cs="Arial" w:eastAsia="Arial" w:hAnsi="Arial"/>
-          <w:color w:val="5A6B66"/>
-          <w:sz w:val="22"/>
-          <w:szCs w:val="22"/>
-        </w:rPr>
-        <w:t xml:space="preserve"> na capa, se desejar).</w:t>
-      </w:r>
-    </w:p>
-    <w:p>
-      <w:pPr>
-        <w:spacing w:after="80" w:before="0"/>
-      </w:pPr>
-      <w:r>
-        <w:rPr>
-          <w:rFonts w:ascii="Arial" w:cs="Arial" w:eastAsia="Arial" w:hAnsi="Arial"/>
-          <w:b/>
-          <w:bCs/>
-          <w:color w:val="1A4A3A"/>
-          <w:sz w:val="22"/>
-          <w:szCs w:val="22"/>
-        </w:rPr>
-        <w:t xml:space="preserve">• </w:t>
-      </w:r>
-      <w:r>
-        <w:rPr>
-          <w:rFonts w:ascii="Arial" w:cs="Arial" w:eastAsia="Arial" w:hAnsi="Arial"/>
-          <w:b/>
-          <w:bCs/>
-          <w:color w:val="1A2E28"/>
-          <w:sz w:val="22"/>
-          <w:szCs w:val="22"/>
-        </w:rPr>
-        <w:t xml:space="preserve">Parte 1 (esta proposta)</w:t>
-      </w:r>
-      <w:r>
-        <w:rPr>
-          <w:rFonts w:ascii="Arial" w:cs="Arial" w:eastAsia="Arial" w:hAnsi="Arial"/>
-          <w:color w:val="5A6B66"/>
-          <w:sz w:val="22"/>
-          <w:szCs w:val="22"/>
-        </w:rPr>
-        <w:t xml:space="preserve"> — atrás da apresentação.</w:t>
-      </w:r>
-    </w:p>
-    <w:p>
-      <w:pPr>
-        <w:spacing w:after="80" w:before="0"/>
-      </w:pPr>
-      <w:r>
-        <w:rPr>
-          <w:rFonts w:ascii="Arial" w:cs="Arial" w:eastAsia="Arial" w:hAnsi="Arial"/>
-          <w:b/>
-          <w:bCs/>
-          <w:color w:val="1A4A3A"/>
-          <w:sz w:val="22"/>
-          <w:szCs w:val="22"/>
-        </w:rPr>
-        <w:t xml:space="preserve">• </w:t>
-      </w:r>
-      <w:r>
-        <w:rPr>
-          <w:rFonts w:ascii="Arial" w:cs="Arial" w:eastAsia="Arial" w:hAnsi="Arial"/>
-          <w:b/>
-          <w:bCs/>
-          <w:color w:val="1A2E28"/>
-          <w:sz w:val="22"/>
-          <w:szCs w:val="22"/>
-        </w:rPr>
-        <w:t xml:space="preserve">Parte 2 (Contrato)</w:t>
-      </w:r>
-      <w:r>
-        <w:rPr>
-          <w:rFonts w:ascii="Arial" w:cs="Arial" w:eastAsia="Arial" w:hAnsi="Arial"/>
-          <w:color w:val="5A6B66"/>
-          <w:sz w:val="22"/>
-          <w:szCs w:val="22"/>
-        </w:rPr>
-        <w:t xml:space="preserve"> — </w:t>
-      </w:r>
-      <w:r>
-        <w:rPr>
-          <w:rFonts w:ascii="Arial" w:cs="Arial" w:eastAsia="Arial" w:hAnsi="Arial"/>
-          <w:b/>
-          <w:bCs/>
-          <w:color w:val="1A2E28"/>
-          <w:sz w:val="22"/>
-          <w:szCs w:val="22"/>
-        </w:rPr>
-        <w:t xml:space="preserve">2 vias</w:t>
-      </w:r>
-      <w:r>
-        <w:rPr>
-          <w:rFonts w:ascii="Arial" w:cs="Arial" w:eastAsia="Arial" w:hAnsi="Arial"/>
-          <w:color w:val="5A6B66"/>
-          <w:sz w:val="22"/>
-          <w:szCs w:val="22"/>
-        </w:rPr>
-        <w:t xml:space="preserve"> para assinatura.</w:t>
-      </w:r>
-    </w:p>
-    <w:p>
-      <w:pPr>
-        <w:spacing w:after="80" w:before="0"/>
-      </w:pPr>
-      <w:r>
-        <w:rPr>
-          <w:rFonts w:ascii="Arial" w:cs="Arial" w:eastAsia="Arial" w:hAnsi="Arial"/>
-          <w:b/>
-          <w:bCs/>
-          <w:color w:val="1A4A3A"/>
-          <w:sz w:val="22"/>
-          <w:szCs w:val="22"/>
-        </w:rPr>
-        <w:t xml:space="preserve">• </w:t>
-      </w:r>
-      <w:r>
-        <w:rPr>
-          <w:rFonts w:ascii="Arial" w:cs="Arial" w:eastAsia="Arial" w:hAnsi="Arial"/>
-          <w:b/>
-          <w:bCs/>
-          <w:color w:val="1A2E28"/>
-          <w:sz w:val="22"/>
-          <w:szCs w:val="22"/>
-        </w:rPr>
-        <w:t xml:space="preserve">Anexos I, II e III</w:t>
-      </w:r>
-      <w:r>
-        <w:rPr>
-          <w:rFonts w:ascii="Arial" w:cs="Arial" w:eastAsia="Arial" w:hAnsi="Arial"/>
-          <w:color w:val="5A6B66"/>
-          <w:sz w:val="22"/>
-          <w:szCs w:val="22"/>
-        </w:rPr>
-        <w:t xml:space="preserve"> — reutilize os do </w:t>
-      </w:r>
-      <w:r>
-        <w:rPr>
-          <w:rFonts w:ascii="Arial" w:cs="Arial" w:eastAsia="Arial" w:hAnsi="Arial"/>
-          <w:color w:val="1A4A3A"/>
-          <w:sz w:val="22"/>
-          <w:szCs w:val="22"/>
-          <w:u w:val="single"/>
-        </w:rPr>
-        <w:t xml:space="preserve">contrato padrão</w:t>
-      </w:r>
-      <w:r>
-        <w:rPr>
-          <w:rFonts w:ascii="Arial" w:cs="Arial" w:eastAsia="Arial" w:hAnsi="Arial"/>
-          <w:color w:val="5A6B66"/>
-          <w:sz w:val="22"/>
-          <w:szCs w:val="22"/>
-        </w:rPr>
-        <w:t xml:space="preserve">, com Anexo I substituído pela versão deste arquivo (seção final).</w:t>
-      </w:r>
-    </w:p>
-    <w:p>
-      <w:pPr>
-        <w:spacing w:after="80" w:before="0"/>
-      </w:pPr>
-      <w:r>
-        <w:rPr>
-          <w:rFonts w:ascii="Arial" w:cs="Arial" w:eastAsia="Arial" w:hAnsi="Arial"/>
-          <w:b/>
-          <w:bCs/>
-          <w:color w:val="1A4A3A"/>
-          <w:sz w:val="22"/>
-          <w:szCs w:val="22"/>
-        </w:rPr>
-        <w:t xml:space="preserve">• </w:t>
-      </w:r>
-      <w:r>
-        <w:rPr>
-          <w:rFonts w:ascii="Arial" w:cs="Arial" w:eastAsia="Arial" w:hAnsi="Arial"/>
-          <w:color w:val="5A6B66"/>
-          <w:sz w:val="22"/>
-          <w:szCs w:val="22"/>
-        </w:rPr>
-        <w:t xml:space="preserve">Numerar proposta sequencialmente (001/2026, 002/2026…).</w:t>
-      </w:r>
-    </w:p>
-    <w:p>
-      <w:pPr>
-        <w:spacing w:after="80" w:before="0"/>
-      </w:pPr>
-      <w:r>
-        <w:rPr>
-          <w:rFonts w:ascii="Arial" w:cs="Arial" w:eastAsia="Arial" w:hAnsi="Arial"/>
-          <w:b/>
-          <w:bCs/>
-          <w:color w:val="1A4A3A"/>
-          <w:sz w:val="22"/>
-          <w:szCs w:val="22"/>
-        </w:rPr>
-        <w:t xml:space="preserve">• </w:t>
-      </w:r>
-      <w:r>
-        <w:rPr>
-          <w:rFonts w:ascii="Arial" w:cs="Arial" w:eastAsia="Arial" w:hAnsi="Arial"/>
-          <w:color w:val="5A6B66"/>
-          <w:sz w:val="22"/>
-          <w:szCs w:val="22"/>
-        </w:rPr>
-        <w:t xml:space="preserve">Site: https://guiadebolso.app · Contato: contato@guiadebolso.app</w:t>
+          <w:sz w:val="24"/>
+          <w:szCs w:val="24"/>
+        </w:rPr>
+        <w:t xml:space="preserve">Programa Parceiro de Lançamento</w:t>
+      </w:r>
+    </w:p>
+    <w:p>
+      <w:pPr>
+        <w:spacing w:after="140" w:before="0"/>
+      </w:pPr>
+      <w:r>
+        <w:rPr>
+          <w:rFonts w:ascii="Arial" w:cs="Arial" w:eastAsia="Arial" w:hAnsi="Arial"/>
+          <w:b/>
+          <w:bCs/>
+          <w:color w:val="1A2E28"/>
+          <w:sz w:val="22"/>
+          <w:szCs w:val="22"/>
+        </w:rPr>
+        <w:t xml:space="preserve">6 meses grátis · sem compromisso de pagamento</w:t>
+      </w:r>
+    </w:p>
+    <w:p>
+      <w:pPr>
+        <w:spacing w:after="140" w:before="0"/>
+      </w:pPr>
+      <w:r>
+        <w:rPr>
+          <w:rFonts w:ascii="Arial" w:cs="Arial" w:eastAsia="Arial" w:hAnsi="Arial"/>
+          <w:b/>
+          <w:bCs/>
+          <w:color w:val="1A2E28"/>
+          <w:sz w:val="22"/>
+          <w:szCs w:val="22"/>
+        </w:rPr>
+        <w:t xml:space="preserve">Proposta nº</w:t>
+      </w:r>
+      <w:r>
+        <w:rPr>
+          <w:rFonts w:ascii="Arial" w:cs="Arial" w:eastAsia="Arial" w:hAnsi="Arial"/>
+          <w:color w:val="5A6B66"/>
+          <w:sz w:val="22"/>
+          <w:szCs w:val="22"/>
+        </w:rPr>
+        <w:t xml:space="preserve"> </w:t>
+      </w:r>
+      <w:r>
+        <w:rPr>
+          <w:rFonts w:ascii="Arial" w:cs="Arial" w:eastAsia="Arial" w:hAnsi="Arial"/>
+          <w:color w:val="5A6B66"/>
+          <w:sz w:val="22"/>
+          <w:szCs w:val="22"/>
+        </w:rPr>
+        <w:t xml:space="preserve"> </w:t>
+      </w:r>
+      <w:r>
+        <w:rPr>
+          <w:rFonts w:ascii="Arial" w:cs="Arial" w:eastAsia="Arial" w:hAnsi="Arial"/>
+          <w:b/>
+          <w:bCs/>
+          <w:color w:val="1A2E28"/>
+          <w:sz w:val="22"/>
+          <w:szCs w:val="22"/>
+        </w:rPr>
+        <w:t xml:space="preserve">/2026</w:t>
+      </w:r>
+    </w:p>
+    <w:p>
+      <w:pPr>
+        <w:spacing w:after="140" w:before="0"/>
+      </w:pPr>
+      <w:r>
+        <w:rPr>
+          <w:rFonts w:ascii="Arial" w:cs="Arial" w:eastAsia="Arial" w:hAnsi="Arial"/>
+          <w:b/>
+          <w:bCs/>
+          <w:color w:val="1A2E28"/>
+          <w:sz w:val="22"/>
+          <w:szCs w:val="22"/>
+        </w:rPr>
+        <w:t xml:space="preserve">Imbituba, Santa Catarina</w:t>
       </w:r>
     </w:p>
     <w:p>
@@ -582,292 +381,97 @@
     </w:p>
     <w:p>
       <w:pPr>
-        <w:pStyle w:val="Heading2"/>
-        <w:shd w:fill="F0F4F3" w:val="clear"/>
-        <w:spacing w:after="140" w:before="240"/>
-      </w:pPr>
-      <w:r>
-        <w:rPr>
-          <w:rFonts w:ascii="Arial" w:cs="Arial" w:eastAsia="Arial" w:hAnsi="Arial"/>
-          <w:b/>
-          <w:bCs/>
-          <w:color w:val="1A4A3A"/>
-          <w:sz w:val="26"/>
-          <w:szCs w:val="26"/>
-        </w:rPr>
-        <w:t xml:space="preserve">Instruções de impressão</w:t>
-      </w:r>
-    </w:p>
-    <w:p>
-      <w:pPr>
-        <w:spacing w:after="80" w:before="0"/>
-      </w:pPr>
-      <w:r>
-        <w:rPr>
-          <w:rFonts w:ascii="Arial" w:cs="Arial" w:eastAsia="Arial" w:hAnsi="Arial"/>
-          <w:b/>
-          <w:bCs/>
-          <w:color w:val="1A4A3A"/>
-          <w:sz w:val="22"/>
-          <w:szCs w:val="22"/>
-        </w:rPr>
-        <w:t xml:space="preserve">• </w:t>
-      </w:r>
-      <w:r>
-        <w:rPr>
-          <w:rFonts w:ascii="Arial" w:cs="Arial" w:eastAsia="Arial" w:hAnsi="Arial"/>
-          <w:b/>
-          <w:bCs/>
-          <w:color w:val="1A2E28"/>
-          <w:sz w:val="22"/>
-          <w:szCs w:val="22"/>
-        </w:rPr>
-        <w:t xml:space="preserve">Apresentação A4</w:t>
-      </w:r>
-      <w:r>
-        <w:rPr>
-          <w:rFonts w:ascii="Arial" w:cs="Arial" w:eastAsia="Arial" w:hAnsi="Arial"/>
-          <w:color w:val="5A6B66"/>
-          <w:sz w:val="22"/>
-          <w:szCs w:val="22"/>
-        </w:rPr>
-        <w:t xml:space="preserve"> — </w:t>
-      </w:r>
-      <w:r>
-        <w:rPr>
-          <w:rFonts w:ascii="Arial" w:cs="Arial" w:eastAsia="Arial" w:hAnsi="Arial"/>
-          <w:color w:val="1A4A3A"/>
+        <w:spacing w:after="140" w:before="0"/>
+      </w:pPr>
+      <w:r>
+        <w:rPr>
+          <w:rFonts w:ascii="Arial" w:cs="Arial" w:eastAsia="Arial" w:hAnsi="Arial"/>
+          <w:b/>
+          <w:bCs/>
+          <w:color w:val="1A2E28"/>
+          <w:sz w:val="22"/>
+          <w:szCs w:val="22"/>
+        </w:rPr>
+        <w:t xml:space="preserve">Estabelecimento:</w:t>
+      </w:r>
+      <w:r>
+        <w:rPr>
+          <w:rFonts w:ascii="Arial" w:cs="Arial" w:eastAsia="Arial" w:hAnsi="Arial"/>
+          <w:color w:val="5A6B66"/>
+          <w:sz w:val="22"/>
+          <w:szCs w:val="22"/>
+        </w:rPr>
+        <w:t xml:space="preserve"> </w:t>
+      </w:r>
+    </w:p>
+    <w:p>
+      <w:pPr>
+        <w:spacing w:after="140" w:before="0"/>
+      </w:pPr>
+      <w:r>
+        <w:rPr>
+          <w:rFonts w:ascii="Arial" w:cs="Arial" w:eastAsia="Arial" w:hAnsi="Arial"/>
+          <w:b/>
+          <w:bCs/>
+          <w:color w:val="1A2E28"/>
+          <w:sz w:val="22"/>
+          <w:szCs w:val="22"/>
+        </w:rPr>
+        <w:t xml:space="preserve">Data:</w:t>
+      </w:r>
+      <w:r>
+        <w:rPr>
+          <w:rFonts w:ascii="Arial" w:cs="Arial" w:eastAsia="Arial" w:hAnsi="Arial"/>
+          <w:color w:val="5A6B66"/>
+          <w:sz w:val="22"/>
+          <w:szCs w:val="22"/>
+        </w:rPr>
+        <w:t xml:space="preserve"> </w:t>
+      </w:r>
+      <w:r>
+        <w:rPr>
+          <w:rFonts w:ascii="Arial" w:cs="Arial" w:eastAsia="Arial" w:hAnsi="Arial"/>
+          <w:color w:val="5A6B66"/>
           <w:sz w:val="22"/>
           <w:szCs w:val="22"/>
           <w:u w:val="single"/>
         </w:rPr>
-        <w:t xml:space="preserve">`docs/materiais/APRESENTACAO-PARCEIRO-A4.html`</w:t>
-      </w:r>
-      <w:r>
-        <w:rPr>
-          <w:rFonts w:ascii="Arial" w:cs="Arial" w:eastAsia="Arial" w:hAnsi="Arial"/>
-          <w:color w:val="5A6B66"/>
-          <w:sz w:val="22"/>
-          <w:szCs w:val="22"/>
-        </w:rPr>
-        <w:t xml:space="preserve"> (edite o HTML antes de imprimir mencionando </w:t>
-      </w:r>
-      <w:r>
-        <w:rPr>
-          <w:rFonts w:ascii="Arial" w:cs="Arial" w:eastAsia="Arial" w:hAnsi="Arial"/>
-          <w:b/>
-          <w:bCs/>
-          <w:color w:val="1A2E28"/>
-          <w:sz w:val="22"/>
-          <w:szCs w:val="22"/>
-        </w:rPr>
-        <w:t xml:space="preserve">6 meses grátis</w:t>
-      </w:r>
-      <w:r>
-        <w:rPr>
-          <w:rFonts w:ascii="Arial" w:cs="Arial" w:eastAsia="Arial" w:hAnsi="Arial"/>
-          <w:color w:val="5A6B66"/>
-          <w:sz w:val="22"/>
-          <w:szCs w:val="22"/>
-        </w:rPr>
-        <w:t xml:space="preserve"> na capa, se desejar).</w:t>
-      </w:r>
-    </w:p>
-    <w:p>
-      <w:pPr>
-        <w:spacing w:after="80" w:before="0"/>
-      </w:pPr>
-      <w:r>
-        <w:rPr>
-          <w:rFonts w:ascii="Arial" w:cs="Arial" w:eastAsia="Arial" w:hAnsi="Arial"/>
-          <w:b/>
-          <w:bCs/>
-          <w:color w:val="1A4A3A"/>
-          <w:sz w:val="22"/>
-          <w:szCs w:val="22"/>
-        </w:rPr>
-        <w:t xml:space="preserve">• </w:t>
-      </w:r>
-      <w:r>
-        <w:rPr>
-          <w:rFonts w:ascii="Arial" w:cs="Arial" w:eastAsia="Arial" w:hAnsi="Arial"/>
-          <w:b/>
-          <w:bCs/>
-          <w:color w:val="1A2E28"/>
-          <w:sz w:val="22"/>
-          <w:szCs w:val="22"/>
-        </w:rPr>
-        <w:t xml:space="preserve">Parte 1 (esta proposta)</w:t>
-      </w:r>
-      <w:r>
-        <w:rPr>
-          <w:rFonts w:ascii="Arial" w:cs="Arial" w:eastAsia="Arial" w:hAnsi="Arial"/>
-          <w:color w:val="5A6B66"/>
-          <w:sz w:val="22"/>
-          <w:szCs w:val="22"/>
-        </w:rPr>
-        <w:t xml:space="preserve"> — atrás da apresentação.</w:t>
-      </w:r>
-    </w:p>
-    <w:p>
-      <w:pPr>
-        <w:spacing w:after="80" w:before="0"/>
-      </w:pPr>
-      <w:r>
-        <w:rPr>
-          <w:rFonts w:ascii="Arial" w:cs="Arial" w:eastAsia="Arial" w:hAnsi="Arial"/>
-          <w:b/>
-          <w:bCs/>
-          <w:color w:val="1A4A3A"/>
-          <w:sz w:val="22"/>
-          <w:szCs w:val="22"/>
-        </w:rPr>
-        <w:t xml:space="preserve">• </w:t>
-      </w:r>
-      <w:r>
-        <w:rPr>
-          <w:rFonts w:ascii="Arial" w:cs="Arial" w:eastAsia="Arial" w:hAnsi="Arial"/>
-          <w:b/>
-          <w:bCs/>
-          <w:color w:val="1A2E28"/>
-          <w:sz w:val="22"/>
-          <w:szCs w:val="22"/>
-        </w:rPr>
-        <w:t xml:space="preserve">Parte 2 (Contrato)</w:t>
-      </w:r>
-      <w:r>
-        <w:rPr>
-          <w:rFonts w:ascii="Arial" w:cs="Arial" w:eastAsia="Arial" w:hAnsi="Arial"/>
-          <w:color w:val="5A6B66"/>
-          <w:sz w:val="22"/>
-          <w:szCs w:val="22"/>
-        </w:rPr>
-        <w:t xml:space="preserve"> — </w:t>
-      </w:r>
-      <w:r>
-        <w:rPr>
-          <w:rFonts w:ascii="Arial" w:cs="Arial" w:eastAsia="Arial" w:hAnsi="Arial"/>
-          <w:b/>
-          <w:bCs/>
-          <w:color w:val="1A2E28"/>
-          <w:sz w:val="22"/>
-          <w:szCs w:val="22"/>
-        </w:rPr>
-        <w:t xml:space="preserve">2 vias</w:t>
-      </w:r>
-      <w:r>
-        <w:rPr>
-          <w:rFonts w:ascii="Arial" w:cs="Arial" w:eastAsia="Arial" w:hAnsi="Arial"/>
-          <w:color w:val="5A6B66"/>
-          <w:sz w:val="22"/>
-          <w:szCs w:val="22"/>
-        </w:rPr>
-        <w:t xml:space="preserve"> para assinatura.</w:t>
-      </w:r>
-    </w:p>
-    <w:p>
-      <w:pPr>
-        <w:spacing w:after="80" w:before="0"/>
-      </w:pPr>
-      <w:r>
-        <w:rPr>
-          <w:rFonts w:ascii="Arial" w:cs="Arial" w:eastAsia="Arial" w:hAnsi="Arial"/>
-          <w:b/>
-          <w:bCs/>
-          <w:color w:val="1A4A3A"/>
-          <w:sz w:val="22"/>
-          <w:szCs w:val="22"/>
-        </w:rPr>
-        <w:t xml:space="preserve">• </w:t>
-      </w:r>
-      <w:r>
-        <w:rPr>
-          <w:rFonts w:ascii="Arial" w:cs="Arial" w:eastAsia="Arial" w:hAnsi="Arial"/>
-          <w:b/>
-          <w:bCs/>
-          <w:color w:val="1A2E28"/>
-          <w:sz w:val="22"/>
-          <w:szCs w:val="22"/>
-        </w:rPr>
-        <w:t xml:space="preserve">Anexos I, II e III</w:t>
-      </w:r>
-      <w:r>
-        <w:rPr>
-          <w:rFonts w:ascii="Arial" w:cs="Arial" w:eastAsia="Arial" w:hAnsi="Arial"/>
-          <w:color w:val="5A6B66"/>
-          <w:sz w:val="22"/>
-          <w:szCs w:val="22"/>
-        </w:rPr>
-        <w:t xml:space="preserve"> — reutilize os do </w:t>
-      </w:r>
-      <w:r>
-        <w:rPr>
-          <w:rFonts w:ascii="Arial" w:cs="Arial" w:eastAsia="Arial" w:hAnsi="Arial"/>
-          <w:color w:val="1A4A3A"/>
+        <w:t xml:space="preserve"> / </w:t>
+      </w:r>
+      <w:r>
+        <w:rPr>
+          <w:rFonts w:ascii="Arial" w:cs="Arial" w:eastAsia="Arial" w:hAnsi="Arial"/>
+          <w:color w:val="5A6B66"/>
           <w:sz w:val="22"/>
           <w:szCs w:val="22"/>
           <w:u w:val="single"/>
         </w:rPr>
-        <w:t xml:space="preserve">contrato padrão</w:t>
-      </w:r>
-      <w:r>
-        <w:rPr>
-          <w:rFonts w:ascii="Arial" w:cs="Arial" w:eastAsia="Arial" w:hAnsi="Arial"/>
-          <w:color w:val="5A6B66"/>
-          <w:sz w:val="22"/>
-          <w:szCs w:val="22"/>
-        </w:rPr>
-        <w:t xml:space="preserve">, com Anexo I substituído pela versão deste arquivo (seção final).</w:t>
-      </w:r>
-    </w:p>
-    <w:p>
-      <w:pPr>
-        <w:spacing w:after="80" w:before="0"/>
-      </w:pPr>
-      <w:r>
-        <w:rPr>
-          <w:rFonts w:ascii="Arial" w:cs="Arial" w:eastAsia="Arial" w:hAnsi="Arial"/>
-          <w:b/>
-          <w:bCs/>
-          <w:color w:val="1A4A3A"/>
-          <w:sz w:val="22"/>
-          <w:szCs w:val="22"/>
-        </w:rPr>
-        <w:t xml:space="preserve">• </w:t>
-      </w:r>
-      <w:r>
-        <w:rPr>
-          <w:rFonts w:ascii="Arial" w:cs="Arial" w:eastAsia="Arial" w:hAnsi="Arial"/>
-          <w:color w:val="5A6B66"/>
-          <w:sz w:val="22"/>
-          <w:szCs w:val="22"/>
-        </w:rPr>
-        <w:t xml:space="preserve">Numerar proposta sequencialmente (001/2026, 002/2026…).</w:t>
-      </w:r>
-    </w:p>
-    <w:p>
-      <w:pPr>
-        <w:spacing w:after="80" w:before="0"/>
-      </w:pPr>
-      <w:r>
-        <w:rPr>
-          <w:rFonts w:ascii="Arial" w:cs="Arial" w:eastAsia="Arial" w:hAnsi="Arial"/>
-          <w:b/>
-          <w:bCs/>
-          <w:color w:val="1A4A3A"/>
-          <w:sz w:val="22"/>
-          <w:szCs w:val="22"/>
-        </w:rPr>
-        <w:t xml:space="preserve">• </w:t>
-      </w:r>
-      <w:r>
-        <w:rPr>
-          <w:rFonts w:ascii="Arial" w:cs="Arial" w:eastAsia="Arial" w:hAnsi="Arial"/>
-          <w:color w:val="5A6B66"/>
-          <w:sz w:val="22"/>
-          <w:szCs w:val="22"/>
-        </w:rPr>
-        <w:t xml:space="preserve">Site: https://guiadebolso.app · Contato: contato@guiadebolso.app</w:t>
+        <w:t xml:space="preserve"> / </w:t>
+      </w:r>
+    </w:p>
+    <w:p>
+      <w:pPr>
+        <w:spacing w:after="140" w:before="0"/>
+      </w:pPr>
+      <w:r>
+        <w:rPr>
+          <w:rFonts w:ascii="Arial" w:cs="Arial" w:eastAsia="Arial" w:hAnsi="Arial"/>
+          <w:b/>
+          <w:bCs/>
+          <w:color w:val="1A2E28"/>
+          <w:sz w:val="22"/>
+          <w:szCs w:val="22"/>
+        </w:rPr>
+        <w:t xml:space="preserve">Validade desta proposta:</w:t>
+      </w:r>
+      <w:r>
+        <w:rPr>
+          <w:rFonts w:ascii="Arial" w:cs="Arial" w:eastAsia="Arial" w:hAnsi="Arial"/>
+          <w:color w:val="5A6B66"/>
+          <w:sz w:val="22"/>
+          <w:szCs w:val="22"/>
+        </w:rPr>
+        <w:t xml:space="preserve"> 30 dias a partir da data acima</w:t>
       </w:r>
     </w:p>
     <w:p>
@@ -880,45 +484,7 @@
     </w:p>
     <w:p>
       <w:pPr>
-        <w:spacing w:after="200" w:before="0"/>
-      </w:pPr>
-    </w:p>
-    <w:p>
-      <w:pPr>
-        <w:spacing w:after="200" w:before="0"/>
-      </w:pPr>
-    </w:p>
-    <w:p>
-      <w:r>
-        <w:br w:type="page"/>
-      </w:r>
-    </w:p>
-    <w:p>
-      <w:r>
-        <w:br w:type="page"/>
-      </w:r>
-    </w:p>
-    <w:p>
-      <w:pPr>
-        <w:pStyle w:val="Heading1"/>
-        <w:spacing w:after="200" w:before="280"/>
-      </w:pPr>
-      <w:r>
-        <w:rPr>
-          <w:rFonts w:ascii="Arial" w:cs="Arial" w:eastAsia="Arial" w:hAnsi="Arial"/>
-          <w:b/>
-          <w:bCs/>
-          <w:color w:val="1A4A3A"/>
-          <w:sz w:val="32"/>
-          <w:szCs w:val="32"/>
-        </w:rPr>
-        <w:t xml:space="preserve">PARTE 1 — PROPOSTA COMERCIAL</w:t>
-      </w:r>
-    </w:p>
-    <w:p>
-      <w:pPr>
         <w:pStyle w:val="Heading2"/>
-        <w:shd w:fill="F0F4F3" w:val="clear"/>
         <w:spacing w:after="140" w:before="240"/>
       </w:pPr>
       <w:r>
@@ -930,7 +496,203 @@
           <w:sz w:val="26"/>
           <w:szCs w:val="26"/>
         </w:rPr>
-        <w:t xml:space="preserve">Programa de Lançamento — 6 meses grátis</w:t>
+        <w:t xml:space="preserve">1. Sobre o programa</w:t>
+      </w:r>
+    </w:p>
+    <w:p>
+      <w:pPr>
+        <w:spacing w:after="140" w:before="0"/>
+      </w:pPr>
+      <w:r>
+        <w:rPr>
+          <w:rFonts w:ascii="Arial" w:cs="Arial" w:eastAsia="Arial" w:hAnsi="Arial"/>
+          <w:color w:val="5A6B66"/>
+          <w:sz w:val="22"/>
+          <w:szCs w:val="22"/>
+        </w:rPr>
+        <w:t xml:space="preserve">O </w:t>
+      </w:r>
+      <w:r>
+        <w:rPr>
+          <w:rFonts w:ascii="Arial" w:cs="Arial" w:eastAsia="Arial" w:hAnsi="Arial"/>
+          <w:b/>
+          <w:bCs/>
+          <w:color w:val="1A2E28"/>
+          <w:sz w:val="22"/>
+          <w:szCs w:val="22"/>
+        </w:rPr>
+        <w:t xml:space="preserve">Guia de Bolso</w:t>
+      </w:r>
+      <w:r>
+        <w:rPr>
+          <w:rFonts w:ascii="Arial" w:cs="Arial" w:eastAsia="Arial" w:hAnsi="Arial"/>
+          <w:color w:val="5A6B66"/>
+          <w:sz w:val="22"/>
+          <w:szCs w:val="22"/>
+        </w:rPr>
+        <w:t xml:space="preserve"> é o guia turístico digital de </w:t>
+      </w:r>
+      <w:r>
+        <w:rPr>
+          <w:rFonts w:ascii="Arial" w:cs="Arial" w:eastAsia="Arial" w:hAnsi="Arial"/>
+          <w:b/>
+          <w:bCs/>
+          <w:color w:val="1A2E28"/>
+          <w:sz w:val="22"/>
+          <w:szCs w:val="22"/>
+        </w:rPr>
+        <w:t xml:space="preserve">Imbituba e região</w:t>
+      </w:r>
+      <w:r>
+        <w:rPr>
+          <w:rFonts w:ascii="Arial" w:cs="Arial" w:eastAsia="Arial" w:hAnsi="Arial"/>
+          <w:color w:val="5A6B66"/>
+          <w:sz w:val="22"/>
+          <w:szCs w:val="22"/>
+        </w:rPr>
+        <w:t xml:space="preserve">. Este documento formaliza a participação do estabelecimento no </w:t>
+      </w:r>
+      <w:r>
+        <w:rPr>
+          <w:rFonts w:ascii="Arial" w:cs="Arial" w:eastAsia="Arial" w:hAnsi="Arial"/>
+          <w:b/>
+          <w:bCs/>
+          <w:color w:val="1A2E28"/>
+          <w:sz w:val="22"/>
+          <w:szCs w:val="22"/>
+        </w:rPr>
+        <w:t xml:space="preserve">programa de lançamento</w:t>
+      </w:r>
+      <w:r>
+        <w:rPr>
+          <w:rFonts w:ascii="Arial" w:cs="Arial" w:eastAsia="Arial" w:hAnsi="Arial"/>
+          <w:color w:val="5A6B66"/>
+          <w:sz w:val="22"/>
+          <w:szCs w:val="22"/>
+        </w:rPr>
+        <w:t xml:space="preserve">, com </w:t>
+      </w:r>
+      <w:r>
+        <w:rPr>
+          <w:rFonts w:ascii="Arial" w:cs="Arial" w:eastAsia="Arial" w:hAnsi="Arial"/>
+          <w:b/>
+          <w:bCs/>
+          <w:color w:val="1A2E28"/>
+          <w:sz w:val="22"/>
+          <w:szCs w:val="22"/>
+        </w:rPr>
+        <w:t xml:space="preserve">6 (seis) meses de Plano Parceiro sem custo</w:t>
+      </w:r>
+      <w:r>
+        <w:rPr>
+          <w:rFonts w:ascii="Arial" w:cs="Arial" w:eastAsia="Arial" w:hAnsi="Arial"/>
+          <w:color w:val="5A6B66"/>
+          <w:sz w:val="22"/>
+          <w:szCs w:val="22"/>
+        </w:rPr>
+        <w:t xml:space="preserve">.</w:t>
+      </w:r>
+    </w:p>
+    <w:p>
+      <w:pPr>
+        <w:spacing w:after="140" w:before="0"/>
+      </w:pPr>
+      <w:r>
+        <w:rPr>
+          <w:rFonts w:ascii="Arial" w:cs="Arial" w:eastAsia="Arial" w:hAnsi="Arial"/>
+          <w:color w:val="5A6B66"/>
+          <w:sz w:val="22"/>
+          <w:szCs w:val="22"/>
+        </w:rPr>
+        <w:t xml:space="preserve">O app permanece </w:t>
+      </w:r>
+      <w:r>
+        <w:rPr>
+          <w:rFonts w:ascii="Arial" w:cs="Arial" w:eastAsia="Arial" w:hAnsi="Arial"/>
+          <w:b/>
+          <w:bCs/>
+          <w:color w:val="1A2E28"/>
+          <w:sz w:val="22"/>
+          <w:szCs w:val="22"/>
+        </w:rPr>
+        <w:t xml:space="preserve">gratuito para turistas</w:t>
+      </w:r>
+      <w:r>
+        <w:rPr>
+          <w:rFonts w:ascii="Arial" w:cs="Arial" w:eastAsia="Arial" w:hAnsi="Arial"/>
+          <w:color w:val="5A6B66"/>
+          <w:sz w:val="22"/>
+          <w:szCs w:val="22"/>
+        </w:rPr>
+        <w:t xml:space="preserve">. O estabelecimento recebe, durante o período promocional, os mesmos benefícios do Plano Parceiro comercial (carrossel, badge, perfil completo, QR, relatórios etc.).</w:t>
+      </w:r>
+    </w:p>
+    <w:p>
+      <w:pPr>
+        <w:spacing w:after="140" w:before="0"/>
+      </w:pPr>
+      <w:r>
+        <w:rPr>
+          <w:rFonts w:ascii="Arial" w:cs="Arial" w:eastAsia="Arial" w:hAnsi="Arial"/>
+          <w:b/>
+          <w:bCs/>
+          <w:color w:val="1A2E28"/>
+          <w:sz w:val="22"/>
+          <w:szCs w:val="22"/>
+        </w:rPr>
+        <w:t xml:space="preserve">Operado por:</w:t>
+      </w:r>
+      <w:r>
+        <w:rPr>
+          <w:rFonts w:ascii="Arial" w:cs="Arial" w:eastAsia="Arial" w:hAnsi="Arial"/>
+          <w:color w:val="5A6B66"/>
+          <w:sz w:val="22"/>
+          <w:szCs w:val="22"/>
+        </w:rPr>
+        <w:t xml:space="preserve"> </w:t>
+      </w:r>
+      <w:r>
+        <w:rPr>
+          <w:rFonts w:ascii="Arial" w:cs="Arial" w:eastAsia="Arial" w:hAnsi="Arial"/>
+          <w:color w:val="5A6B66"/>
+          <w:sz w:val="22"/>
+          <w:szCs w:val="22"/>
+        </w:rPr>
+        <w:t xml:space="preserve">RAZÃO SOCIAL</w:t>
+      </w:r>
+      <w:r>
+        <w:rPr>
+          <w:rFonts w:ascii="Arial" w:cs="Arial" w:eastAsia="Arial" w:hAnsi="Arial"/>
+          <w:color w:val="5A6B66"/>
+          <w:sz w:val="22"/>
+          <w:szCs w:val="22"/>
+        </w:rPr>
+        <w:t xml:space="preserve">, LTDA — CNPJ 40.534.524/0001-87</w:t>
+      </w:r>
+    </w:p>
+    <w:p>
+      <w:pPr>
+        <w:spacing w:after="140" w:before="0"/>
+      </w:pPr>
+      <w:r>
+        <w:rPr>
+          <w:rFonts w:ascii="Arial" w:cs="Arial" w:eastAsia="Arial" w:hAnsi="Arial"/>
+          <w:b/>
+          <w:bCs/>
+          <w:color w:val="1A2E28"/>
+          <w:sz w:val="22"/>
+          <w:szCs w:val="22"/>
+        </w:rPr>
+        <w:t xml:space="preserve">Nome fantasia:</w:t>
+      </w:r>
+      <w:r>
+        <w:rPr>
+          <w:rFonts w:ascii="Arial" w:cs="Arial" w:eastAsia="Arial" w:hAnsi="Arial"/>
+          <w:color w:val="5A6B66"/>
+          <w:sz w:val="22"/>
+          <w:szCs w:val="22"/>
+        </w:rPr>
+        <w:t xml:space="preserve"> Guia de Bolso · https://guiadebolso.app</w:t>
       </w:r>
     </w:p>
     <w:p>
@@ -944,7 +706,6 @@
     <w:p>
       <w:pPr>
         <w:pStyle w:val="Heading2"/>
-        <w:shd w:fill="F0F4F3" w:val="clear"/>
         <w:spacing w:after="140" w:before="240"/>
       </w:pPr>
       <w:r>
@@ -956,14 +717,46 @@
           <w:sz w:val="26"/>
           <w:szCs w:val="26"/>
         </w:rPr>
-        <w:t xml:space="preserve">Capa</w:t>
-      </w:r>
-    </w:p>
-    <w:p>
-      <w:pPr>
-        <w:pStyle w:val="Heading1"/>
-        <w:spacing w:after="200" w:before="280"/>
-        <w:jc w:val="center"/>
+        <w:t xml:space="preserve">2. O que está incluso (6 meses)</w:t>
+      </w:r>
+    </w:p>
+    <w:p>
+      <w:pPr>
+        <w:spacing w:after="140" w:before="0"/>
+      </w:pPr>
+      <w:r>
+        <w:rPr>
+          <w:rFonts w:ascii="Arial" w:cs="Arial" w:eastAsia="Arial" w:hAnsi="Arial"/>
+          <w:color w:val="5A6B66"/>
+          <w:sz w:val="22"/>
+          <w:szCs w:val="22"/>
+        </w:rPr>
+        <w:t xml:space="preserve">Os benefícios são os do </w:t>
+      </w:r>
+      <w:r>
+        <w:rPr>
+          <w:rFonts w:ascii="Arial" w:cs="Arial" w:eastAsia="Arial" w:hAnsi="Arial"/>
+          <w:b/>
+          <w:bCs/>
+          <w:color w:val="1A2E28"/>
+          <w:sz w:val="22"/>
+          <w:szCs w:val="22"/>
+        </w:rPr>
+        <w:t xml:space="preserve">Plano Parceiro do Guia</w:t>
+      </w:r>
+      <w:r>
+        <w:rPr>
+          <w:rFonts w:ascii="Arial" w:cs="Arial" w:eastAsia="Arial" w:hAnsi="Arial"/>
+          <w:color w:val="5A6B66"/>
+          <w:sz w:val="22"/>
+          <w:szCs w:val="22"/>
+        </w:rPr>
+        <w:t xml:space="preserve"> (detalhados no Anexo I):</w:t>
+      </w:r>
+    </w:p>
+    <w:p>
+      <w:pPr>
+        <w:spacing w:after="80" w:before="0"/>
       </w:pPr>
       <w:r>
         <w:rPr>
@@ -971,16 +764,24 @@
           <w:b/>
           <w:bCs/>
           <w:color w:val="1A4A3A"/>
-          <w:sz w:val="32"/>
-          <w:szCs w:val="32"/>
-        </w:rPr>
-        <w:t xml:space="preserve">Guia de Bolso</w:t>
-      </w:r>
-    </w:p>
-    <w:p>
-      <w:pPr>
-        <w:pStyle w:val="Heading3"/>
-        <w:spacing w:after="120" w:before="200"/>
+          <w:sz w:val="22"/>
+          <w:szCs w:val="22"/>
+        </w:rPr>
+        <w:t xml:space="preserve">• </w:t>
+      </w:r>
+      <w:r>
+        <w:rPr>
+          <w:rFonts w:ascii="Arial" w:cs="Arial" w:eastAsia="Arial" w:hAnsi="Arial"/>
+          <w:color w:val="5A6B66"/>
+          <w:sz w:val="22"/>
+          <w:szCs w:val="22"/>
+        </w:rPr>
+        <w:t xml:space="preserve">Carrossel “Parceiros do Guia” na home</w:t>
+      </w:r>
+    </w:p>
+    <w:p>
+      <w:pPr>
+        <w:spacing w:after="80" w:before="0"/>
       </w:pPr>
       <w:r>
         <w:rPr>
@@ -988,90 +789,119 @@
           <w:b/>
           <w:bCs/>
           <w:color w:val="1A4A3A"/>
-          <w:sz w:val="24"/>
-          <w:szCs w:val="24"/>
-        </w:rPr>
-        <w:t xml:space="preserve">Programa Parceiro de Lançamento</w:t>
-      </w:r>
-    </w:p>
-    <w:p>
-      <w:pPr>
-        <w:spacing w:after="140" w:before="0"/>
-        <w:jc w:val="center"/>
-      </w:pPr>
-      <w:r>
-        <w:rPr>
-          <w:rFonts w:ascii="Arial" w:cs="Arial" w:eastAsia="Arial" w:hAnsi="Arial"/>
-          <w:b/>
-          <w:bCs/>
-          <w:color w:val="1A2E28"/>
-          <w:sz w:val="22"/>
-          <w:szCs w:val="22"/>
-        </w:rPr>
-        <w:t xml:space="preserve">6 meses grátis · sem compromisso de pagamento</w:t>
-      </w:r>
-    </w:p>
-    <w:p>
-      <w:pPr>
-        <w:spacing w:after="140" w:before="0"/>
-        <w:jc w:val="center"/>
-      </w:pPr>
-      <w:r>
-        <w:rPr>
-          <w:rFonts w:ascii="Arial" w:cs="Arial" w:eastAsia="Arial" w:hAnsi="Arial"/>
-          <w:b/>
-          <w:bCs/>
-          <w:color w:val="1A2E28"/>
-          <w:sz w:val="22"/>
-          <w:szCs w:val="22"/>
-        </w:rPr>
-        <w:t xml:space="preserve">Proposta nº</w:t>
-      </w:r>
-      <w:r>
-        <w:rPr>
-          <w:rFonts w:ascii="Arial" w:cs="Arial" w:eastAsia="Arial" w:hAnsi="Arial"/>
-          <w:color w:val="5A6B66"/>
-          <w:sz w:val="22"/>
-          <w:szCs w:val="22"/>
-        </w:rPr>
-        <w:t xml:space="preserve"> </w:t>
-      </w:r>
-      <w:r>
-        <w:rPr>
-          <w:rFonts w:ascii="Arial" w:cs="Arial" w:eastAsia="Arial" w:hAnsi="Arial"/>
-          <w:color w:val="5A6B66"/>
-          <w:sz w:val="22"/>
-          <w:szCs w:val="22"/>
-        </w:rPr>
-        <w:t xml:space="preserve"> </w:t>
-      </w:r>
-      <w:r>
-        <w:rPr>
-          <w:rFonts w:ascii="Arial" w:cs="Arial" w:eastAsia="Arial" w:hAnsi="Arial"/>
-          <w:b/>
-          <w:bCs/>
-          <w:color w:val="1A2E28"/>
-          <w:sz w:val="22"/>
-          <w:szCs w:val="22"/>
-        </w:rPr>
-        <w:t xml:space="preserve">/2026</w:t>
-      </w:r>
-    </w:p>
-    <w:p>
-      <w:pPr>
-        <w:spacing w:after="140" w:before="0"/>
-        <w:jc w:val="center"/>
-      </w:pPr>
-      <w:r>
-        <w:rPr>
-          <w:rFonts w:ascii="Arial" w:cs="Arial" w:eastAsia="Arial" w:hAnsi="Arial"/>
-          <w:b/>
-          <w:bCs/>
-          <w:color w:val="1A2E28"/>
-          <w:sz w:val="22"/>
-          <w:szCs w:val="22"/>
-        </w:rPr>
-        <w:t xml:space="preserve">Imbituba, Santa Catarina</w:t>
+          <w:sz w:val="22"/>
+          <w:szCs w:val="22"/>
+        </w:rPr>
+        <w:t xml:space="preserve">• </w:t>
+      </w:r>
+      <w:r>
+        <w:rPr>
+          <w:rFonts w:ascii="Arial" w:cs="Arial" w:eastAsia="Arial" w:hAnsi="Arial"/>
+          <w:color w:val="5A6B66"/>
+          <w:sz w:val="22"/>
+          <w:szCs w:val="22"/>
+        </w:rPr>
+        <w:t xml:space="preserve">Badge “Parceiro do Guia”</w:t>
+      </w:r>
+    </w:p>
+    <w:p>
+      <w:pPr>
+        <w:spacing w:after="80" w:before="0"/>
+      </w:pPr>
+      <w:r>
+        <w:rPr>
+          <w:rFonts w:ascii="Arial" w:cs="Arial" w:eastAsia="Arial" w:hAnsi="Arial"/>
+          <w:b/>
+          <w:bCs/>
+          <w:color w:val="1A4A3A"/>
+          <w:sz w:val="22"/>
+          <w:szCs w:val="22"/>
+        </w:rPr>
+        <w:t xml:space="preserve">• </w:t>
+      </w:r>
+      <w:r>
+        <w:rPr>
+          <w:rFonts w:ascii="Arial" w:cs="Arial" w:eastAsia="Arial" w:hAnsi="Arial"/>
+          <w:color w:val="5A6B66"/>
+          <w:sz w:val="22"/>
+          <w:szCs w:val="22"/>
+        </w:rPr>
+        <w:t xml:space="preserve">Perfil completo (fotos, horários, links, IR AGORA)</w:t>
+      </w:r>
+    </w:p>
+    <w:p>
+      <w:pPr>
+        <w:spacing w:after="80" w:before="0"/>
+      </w:pPr>
+      <w:r>
+        <w:rPr>
+          <w:rFonts w:ascii="Arial" w:cs="Arial" w:eastAsia="Arial" w:hAnsi="Arial"/>
+          <w:b/>
+          <w:bCs/>
+          <w:color w:val="1A4A3A"/>
+          <w:sz w:val="22"/>
+          <w:szCs w:val="22"/>
+        </w:rPr>
+        <w:t xml:space="preserve">• </w:t>
+      </w:r>
+      <w:r>
+        <w:rPr>
+          <w:rFonts w:ascii="Arial" w:cs="Arial" w:eastAsia="Arial" w:hAnsi="Arial"/>
+          <w:color w:val="5A6B66"/>
+          <w:sz w:val="22"/>
+          <w:szCs w:val="22"/>
+        </w:rPr>
+        <w:t xml:space="preserve">Prioridade na busca com IA e nos roteiros</w:t>
+      </w:r>
+    </w:p>
+    <w:p>
+      <w:pPr>
+        <w:spacing w:after="80" w:before="0"/>
+      </w:pPr>
+      <w:r>
+        <w:rPr>
+          <w:rFonts w:ascii="Arial" w:cs="Arial" w:eastAsia="Arial" w:hAnsi="Arial"/>
+          <w:b/>
+          <w:bCs/>
+          <w:color w:val="1A4A3A"/>
+          <w:sz w:val="22"/>
+          <w:szCs w:val="22"/>
+        </w:rPr>
+        <w:t xml:space="preserve">• </w:t>
+      </w:r>
+      <w:r>
+        <w:rPr>
+          <w:rFonts w:ascii="Arial" w:cs="Arial" w:eastAsia="Arial" w:hAnsi="Arial"/>
+          <w:color w:val="5A6B66"/>
+          <w:sz w:val="22"/>
+          <w:szCs w:val="22"/>
+        </w:rPr>
+        <w:t xml:space="preserve">QR Code personalizado + PDF para o balcão</w:t>
+      </w:r>
+    </w:p>
+    <w:p>
+      <w:pPr>
+        <w:spacing w:after="80" w:before="0"/>
+      </w:pPr>
+      <w:r>
+        <w:rPr>
+          <w:rFonts w:ascii="Arial" w:cs="Arial" w:eastAsia="Arial" w:hAnsi="Arial"/>
+          <w:b/>
+          <w:bCs/>
+          <w:color w:val="1A4A3A"/>
+          <w:sz w:val="22"/>
+          <w:szCs w:val="22"/>
+        </w:rPr>
+        <w:t xml:space="preserve">• </w:t>
+      </w:r>
+      <w:r>
+        <w:rPr>
+          <w:rFonts w:ascii="Arial" w:cs="Arial" w:eastAsia="Arial" w:hAnsi="Arial"/>
+          <w:color w:val="5A6B66"/>
+          <w:sz w:val="22"/>
+          <w:szCs w:val="22"/>
+        </w:rPr>
+        <w:t xml:space="preserve">Relatório mensal de visualizações, scans e cliques</w:t>
       </w:r>
     </w:p>
     <w:p>
@@ -1084,544 +914,7 @@
     </w:p>
     <w:p>
       <w:pPr>
-        <w:spacing w:after="140" w:before="0"/>
-        <w:jc w:val="center"/>
-      </w:pPr>
-      <w:r>
-        <w:rPr>
-          <w:rFonts w:ascii="Arial" w:cs="Arial" w:eastAsia="Arial" w:hAnsi="Arial"/>
-          <w:b/>
-          <w:bCs/>
-          <w:color w:val="1A2E28"/>
-          <w:sz w:val="22"/>
-          <w:szCs w:val="22"/>
-        </w:rPr>
-        <w:t xml:space="preserve">Estabelecimento:</w:t>
-      </w:r>
-      <w:r>
-        <w:rPr>
-          <w:rFonts w:ascii="Arial" w:cs="Arial" w:eastAsia="Arial" w:hAnsi="Arial"/>
-          <w:color w:val="5A6B66"/>
-          <w:sz w:val="22"/>
-          <w:szCs w:val="22"/>
-        </w:rPr>
-        <w:t xml:space="preserve"> </w:t>
-      </w:r>
-    </w:p>
-    <w:p>
-      <w:pPr>
-        <w:spacing w:after="140" w:before="0"/>
-        <w:jc w:val="center"/>
-      </w:pPr>
-      <w:r>
-        <w:rPr>
-          <w:rFonts w:ascii="Arial" w:cs="Arial" w:eastAsia="Arial" w:hAnsi="Arial"/>
-          <w:b/>
-          <w:bCs/>
-          <w:color w:val="1A2E28"/>
-          <w:sz w:val="22"/>
-          <w:szCs w:val="22"/>
-        </w:rPr>
-        <w:t xml:space="preserve">Data:</w:t>
-      </w:r>
-      <w:r>
-        <w:rPr>
-          <w:rFonts w:ascii="Arial" w:cs="Arial" w:eastAsia="Arial" w:hAnsi="Arial"/>
-          <w:color w:val="5A6B66"/>
-          <w:sz w:val="22"/>
-          <w:szCs w:val="22"/>
-        </w:rPr>
-        <w:t xml:space="preserve"> </w:t>
-      </w:r>
-      <w:r>
-        <w:rPr>
-          <w:rFonts w:ascii="Arial" w:cs="Arial" w:eastAsia="Arial" w:hAnsi="Arial"/>
-          <w:sz w:val="22"/>
-          <w:szCs w:val="22"/>
-          <w:u w:val="single"/>
-        </w:rPr>
-        <w:t xml:space="preserve"> / </w:t>
-      </w:r>
-      <w:r>
-        <w:rPr>
-          <w:rFonts w:ascii="Arial" w:cs="Arial" w:eastAsia="Arial" w:hAnsi="Arial"/>
-          <w:sz w:val="22"/>
-          <w:szCs w:val="22"/>
-          <w:u w:val="single"/>
-        </w:rPr>
-        <w:t xml:space="preserve"> / </w:t>
-      </w:r>
-    </w:p>
-    <w:p>
-      <w:pPr>
-        <w:spacing w:after="140" w:before="0"/>
-        <w:jc w:val="center"/>
-      </w:pPr>
-      <w:r>
-        <w:rPr>
-          <w:rFonts w:ascii="Arial" w:cs="Arial" w:eastAsia="Arial" w:hAnsi="Arial"/>
-          <w:b/>
-          <w:bCs/>
-          <w:color w:val="1A2E28"/>
-          <w:sz w:val="22"/>
-          <w:szCs w:val="22"/>
-        </w:rPr>
-        <w:t xml:space="preserve">Validade desta proposta:</w:t>
-      </w:r>
-      <w:r>
-        <w:rPr>
-          <w:rFonts w:ascii="Arial" w:cs="Arial" w:eastAsia="Arial" w:hAnsi="Arial"/>
-          <w:color w:val="5A6B66"/>
-          <w:sz w:val="22"/>
-          <w:szCs w:val="22"/>
-        </w:rPr>
-        <w:t xml:space="preserve"> 30 dias a partir da data acima</w:t>
-      </w:r>
-    </w:p>
-    <w:p>
-      <w:pPr>
-        <w:pBdr>
-          <w:bottom w:val="single" w:color="1A4A3A" w:sz="6"/>
-        </w:pBdr>
-        <w:spacing w:after="200" w:before="200"/>
-      </w:pPr>
-    </w:p>
-    <w:p>
-      <w:pPr>
         <w:pStyle w:val="Heading2"/>
-        <w:shd w:fill="F0F4F3" w:val="clear"/>
-        <w:spacing w:after="140" w:before="240"/>
-      </w:pPr>
-      <w:r>
-        <w:rPr>
-          <w:rFonts w:ascii="Arial" w:cs="Arial" w:eastAsia="Arial" w:hAnsi="Arial"/>
-          <w:b/>
-          <w:bCs/>
-          <w:color w:val="1A4A3A"/>
-          <w:sz w:val="26"/>
-          <w:szCs w:val="26"/>
-        </w:rPr>
-        <w:t xml:space="preserve">1. Sobre o programa</w:t>
-      </w:r>
-    </w:p>
-    <w:p>
-      <w:pPr>
-        <w:spacing w:after="140" w:before="0"/>
-      </w:pPr>
-      <w:r>
-        <w:rPr>
-          <w:rFonts w:ascii="Arial" w:cs="Arial" w:eastAsia="Arial" w:hAnsi="Arial"/>
-          <w:color w:val="5A6B66"/>
-          <w:sz w:val="22"/>
-          <w:szCs w:val="22"/>
-        </w:rPr>
-        <w:t xml:space="preserve">O </w:t>
-      </w:r>
-      <w:r>
-        <w:rPr>
-          <w:rFonts w:ascii="Arial" w:cs="Arial" w:eastAsia="Arial" w:hAnsi="Arial"/>
-          <w:b/>
-          <w:bCs/>
-          <w:color w:val="1A2E28"/>
-          <w:sz w:val="22"/>
-          <w:szCs w:val="22"/>
-        </w:rPr>
-        <w:t xml:space="preserve">Guia de Bolso</w:t>
-      </w:r>
-      <w:r>
-        <w:rPr>
-          <w:rFonts w:ascii="Arial" w:cs="Arial" w:eastAsia="Arial" w:hAnsi="Arial"/>
-          <w:color w:val="5A6B66"/>
-          <w:sz w:val="22"/>
-          <w:szCs w:val="22"/>
-        </w:rPr>
-        <w:t xml:space="preserve"> é o guia turístico digital de </w:t>
-      </w:r>
-      <w:r>
-        <w:rPr>
-          <w:rFonts w:ascii="Arial" w:cs="Arial" w:eastAsia="Arial" w:hAnsi="Arial"/>
-          <w:b/>
-          <w:bCs/>
-          <w:color w:val="1A2E28"/>
-          <w:sz w:val="22"/>
-          <w:szCs w:val="22"/>
-        </w:rPr>
-        <w:t xml:space="preserve">Imbituba e região</w:t>
-      </w:r>
-      <w:r>
-        <w:rPr>
-          <w:rFonts w:ascii="Arial" w:cs="Arial" w:eastAsia="Arial" w:hAnsi="Arial"/>
-          <w:color w:val="5A6B66"/>
-          <w:sz w:val="22"/>
-          <w:szCs w:val="22"/>
-        </w:rPr>
-        <w:t xml:space="preserve">. Este documento formaliza a participação do estabelecimento no </w:t>
-      </w:r>
-      <w:r>
-        <w:rPr>
-          <w:rFonts w:ascii="Arial" w:cs="Arial" w:eastAsia="Arial" w:hAnsi="Arial"/>
-          <w:b/>
-          <w:bCs/>
-          <w:color w:val="1A2E28"/>
-          <w:sz w:val="22"/>
-          <w:szCs w:val="22"/>
-        </w:rPr>
-        <w:t xml:space="preserve">programa de lançamento</w:t>
-      </w:r>
-      <w:r>
-        <w:rPr>
-          <w:rFonts w:ascii="Arial" w:cs="Arial" w:eastAsia="Arial" w:hAnsi="Arial"/>
-          <w:color w:val="5A6B66"/>
-          <w:sz w:val="22"/>
-          <w:szCs w:val="22"/>
-        </w:rPr>
-        <w:t xml:space="preserve">, com </w:t>
-      </w:r>
-      <w:r>
-        <w:rPr>
-          <w:rFonts w:ascii="Arial" w:cs="Arial" w:eastAsia="Arial" w:hAnsi="Arial"/>
-          <w:b/>
-          <w:bCs/>
-          <w:color w:val="1A2E28"/>
-          <w:sz w:val="22"/>
-          <w:szCs w:val="22"/>
-        </w:rPr>
-        <w:t xml:space="preserve">6 (seis) meses de Plano Parceiro sem custo</w:t>
-      </w:r>
-      <w:r>
-        <w:rPr>
-          <w:rFonts w:ascii="Arial" w:cs="Arial" w:eastAsia="Arial" w:hAnsi="Arial"/>
-          <w:color w:val="5A6B66"/>
-          <w:sz w:val="22"/>
-          <w:szCs w:val="22"/>
-        </w:rPr>
-        <w:t xml:space="preserve">.</w:t>
-      </w:r>
-    </w:p>
-    <w:p>
-      <w:pPr>
-        <w:spacing w:after="140" w:before="0"/>
-      </w:pPr>
-      <w:r>
-        <w:rPr>
-          <w:rFonts w:ascii="Arial" w:cs="Arial" w:eastAsia="Arial" w:hAnsi="Arial"/>
-          <w:color w:val="5A6B66"/>
-          <w:sz w:val="22"/>
-          <w:szCs w:val="22"/>
-        </w:rPr>
-        <w:t xml:space="preserve">O app permanece </w:t>
-      </w:r>
-      <w:r>
-        <w:rPr>
-          <w:rFonts w:ascii="Arial" w:cs="Arial" w:eastAsia="Arial" w:hAnsi="Arial"/>
-          <w:b/>
-          <w:bCs/>
-          <w:color w:val="1A2E28"/>
-          <w:sz w:val="22"/>
-          <w:szCs w:val="22"/>
-        </w:rPr>
-        <w:t xml:space="preserve">gratuito para turistas</w:t>
-      </w:r>
-      <w:r>
-        <w:rPr>
-          <w:rFonts w:ascii="Arial" w:cs="Arial" w:eastAsia="Arial" w:hAnsi="Arial"/>
-          <w:color w:val="5A6B66"/>
-          <w:sz w:val="22"/>
-          <w:szCs w:val="22"/>
-        </w:rPr>
-        <w:t xml:space="preserve">. O estabelecimento recebe, durante o período promocional, os mesmos benefícios do Plano Parceiro comercial (carrossel, badge, perfil completo, QR, relatórios etc.).</w:t>
-      </w:r>
-    </w:p>
-    <w:p>
-      <w:pPr>
-        <w:spacing w:after="140" w:before="0"/>
-      </w:pPr>
-      <w:r>
-        <w:rPr>
-          <w:rFonts w:ascii="Arial" w:cs="Arial" w:eastAsia="Arial" w:hAnsi="Arial"/>
-          <w:b/>
-          <w:bCs/>
-          <w:color w:val="1A2E28"/>
-          <w:sz w:val="22"/>
-          <w:szCs w:val="22"/>
-        </w:rPr>
-        <w:t xml:space="preserve">Operado por:</w:t>
-      </w:r>
-      <w:r>
-        <w:rPr>
-          <w:rFonts w:ascii="Arial" w:cs="Arial" w:eastAsia="Arial" w:hAnsi="Arial"/>
-          <w:color w:val="5A6B66"/>
-          <w:sz w:val="22"/>
-          <w:szCs w:val="22"/>
-        </w:rPr>
-        <w:t xml:space="preserve"> </w:t>
-      </w:r>
-      <w:r>
-        <w:rPr>
-          <w:rFonts w:ascii="Arial" w:cs="Arial" w:eastAsia="Arial" w:hAnsi="Arial"/>
-          <w:color w:val="5A6B66"/>
-          <w:sz w:val="22"/>
-          <w:szCs w:val="22"/>
-        </w:rPr>
-        <w:t xml:space="preserve">RAZÃO SOCIAL</w:t>
-      </w:r>
-      <w:r>
-        <w:rPr>
-          <w:rFonts w:ascii="Arial" w:cs="Arial" w:eastAsia="Arial" w:hAnsi="Arial"/>
-          <w:color w:val="5A6B66"/>
-          <w:sz w:val="22"/>
-          <w:szCs w:val="22"/>
-        </w:rPr>
-        <w:t xml:space="preserve">, LTDA — CNPJ 40.534.524/0001-87</w:t>
-      </w:r>
-    </w:p>
-    <w:p>
-      <w:pPr>
-        <w:spacing w:after="140" w:before="0"/>
-      </w:pPr>
-      <w:r>
-        <w:rPr>
-          <w:rFonts w:ascii="Arial" w:cs="Arial" w:eastAsia="Arial" w:hAnsi="Arial"/>
-          <w:b/>
-          <w:bCs/>
-          <w:color w:val="1A2E28"/>
-          <w:sz w:val="22"/>
-          <w:szCs w:val="22"/>
-        </w:rPr>
-        <w:t xml:space="preserve">Nome fantasia:</w:t>
-      </w:r>
-      <w:r>
-        <w:rPr>
-          <w:rFonts w:ascii="Arial" w:cs="Arial" w:eastAsia="Arial" w:hAnsi="Arial"/>
-          <w:color w:val="5A6B66"/>
-          <w:sz w:val="22"/>
-          <w:szCs w:val="22"/>
-        </w:rPr>
-        <w:t xml:space="preserve"> Guia de Bolso · https://guiadebolso.app</w:t>
-      </w:r>
-    </w:p>
-    <w:p>
-      <w:pPr>
-        <w:pBdr>
-          <w:bottom w:val="single" w:color="1A4A3A" w:sz="6"/>
-        </w:pBdr>
-        <w:spacing w:after="200" w:before="200"/>
-      </w:pPr>
-    </w:p>
-    <w:p>
-      <w:pPr>
-        <w:pStyle w:val="Heading2"/>
-        <w:shd w:fill="F0F4F3" w:val="clear"/>
-        <w:spacing w:after="140" w:before="240"/>
-      </w:pPr>
-      <w:r>
-        <w:rPr>
-          <w:rFonts w:ascii="Arial" w:cs="Arial" w:eastAsia="Arial" w:hAnsi="Arial"/>
-          <w:b/>
-          <w:bCs/>
-          <w:color w:val="1A4A3A"/>
-          <w:sz w:val="26"/>
-          <w:szCs w:val="26"/>
-        </w:rPr>
-        <w:t xml:space="preserve">2. O que está incluso (6 meses)</w:t>
-      </w:r>
-    </w:p>
-    <w:p>
-      <w:pPr>
-        <w:spacing w:after="140" w:before="0"/>
-      </w:pPr>
-      <w:r>
-        <w:rPr>
-          <w:rFonts w:ascii="Arial" w:cs="Arial" w:eastAsia="Arial" w:hAnsi="Arial"/>
-          <w:color w:val="5A6B66"/>
-          <w:sz w:val="22"/>
-          <w:szCs w:val="22"/>
-        </w:rPr>
-        <w:t xml:space="preserve">Os benefícios são os do </w:t>
-      </w:r>
-      <w:r>
-        <w:rPr>
-          <w:rFonts w:ascii="Arial" w:cs="Arial" w:eastAsia="Arial" w:hAnsi="Arial"/>
-          <w:b/>
-          <w:bCs/>
-          <w:color w:val="1A2E28"/>
-          <w:sz w:val="22"/>
-          <w:szCs w:val="22"/>
-        </w:rPr>
-        <w:t xml:space="preserve">Plano Parceiro do Guia</w:t>
-      </w:r>
-      <w:r>
-        <w:rPr>
-          <w:rFonts w:ascii="Arial" w:cs="Arial" w:eastAsia="Arial" w:hAnsi="Arial"/>
-          <w:color w:val="5A6B66"/>
-          <w:sz w:val="22"/>
-          <w:szCs w:val="22"/>
-        </w:rPr>
-        <w:t xml:space="preserve"> (detalhados no Anexo I):</w:t>
-      </w:r>
-    </w:p>
-    <w:p>
-      <w:pPr>
-        <w:spacing w:after="80" w:before="0"/>
-      </w:pPr>
-      <w:r>
-        <w:rPr>
-          <w:rFonts w:ascii="Arial" w:cs="Arial" w:eastAsia="Arial" w:hAnsi="Arial"/>
-          <w:b/>
-          <w:bCs/>
-          <w:color w:val="1A4A3A"/>
-          <w:sz w:val="22"/>
-          <w:szCs w:val="22"/>
-        </w:rPr>
-        <w:t xml:space="preserve">• </w:t>
-      </w:r>
-      <w:r>
-        <w:rPr>
-          <w:rFonts w:ascii="Arial" w:cs="Arial" w:eastAsia="Arial" w:hAnsi="Arial"/>
-          <w:color w:val="5A6B66"/>
-          <w:sz w:val="22"/>
-          <w:szCs w:val="22"/>
-        </w:rPr>
-        <w:t xml:space="preserve">Carrossel “Parceiros do Guia” na home</w:t>
-      </w:r>
-    </w:p>
-    <w:p>
-      <w:pPr>
-        <w:spacing w:after="80" w:before="0"/>
-      </w:pPr>
-      <w:r>
-        <w:rPr>
-          <w:rFonts w:ascii="Arial" w:cs="Arial" w:eastAsia="Arial" w:hAnsi="Arial"/>
-          <w:b/>
-          <w:bCs/>
-          <w:color w:val="1A4A3A"/>
-          <w:sz w:val="22"/>
-          <w:szCs w:val="22"/>
-        </w:rPr>
-        <w:t xml:space="preserve">• </w:t>
-      </w:r>
-      <w:r>
-        <w:rPr>
-          <w:rFonts w:ascii="Arial" w:cs="Arial" w:eastAsia="Arial" w:hAnsi="Arial"/>
-          <w:color w:val="5A6B66"/>
-          <w:sz w:val="22"/>
-          <w:szCs w:val="22"/>
-        </w:rPr>
-        <w:t xml:space="preserve">Badge “Parceiro do Guia”</w:t>
-      </w:r>
-    </w:p>
-    <w:p>
-      <w:pPr>
-        <w:spacing w:after="80" w:before="0"/>
-      </w:pPr>
-      <w:r>
-        <w:rPr>
-          <w:rFonts w:ascii="Arial" w:cs="Arial" w:eastAsia="Arial" w:hAnsi="Arial"/>
-          <w:b/>
-          <w:bCs/>
-          <w:color w:val="1A4A3A"/>
-          <w:sz w:val="22"/>
-          <w:szCs w:val="22"/>
-        </w:rPr>
-        <w:t xml:space="preserve">• </w:t>
-      </w:r>
-      <w:r>
-        <w:rPr>
-          <w:rFonts w:ascii="Arial" w:cs="Arial" w:eastAsia="Arial" w:hAnsi="Arial"/>
-          <w:color w:val="5A6B66"/>
-          <w:sz w:val="22"/>
-          <w:szCs w:val="22"/>
-        </w:rPr>
-        <w:t xml:space="preserve">Perfil completo (fotos, horários, links, IR AGORA)</w:t>
-      </w:r>
-    </w:p>
-    <w:p>
-      <w:pPr>
-        <w:spacing w:after="80" w:before="0"/>
-      </w:pPr>
-      <w:r>
-        <w:rPr>
-          <w:rFonts w:ascii="Arial" w:cs="Arial" w:eastAsia="Arial" w:hAnsi="Arial"/>
-          <w:b/>
-          <w:bCs/>
-          <w:color w:val="1A4A3A"/>
-          <w:sz w:val="22"/>
-          <w:szCs w:val="22"/>
-        </w:rPr>
-        <w:t xml:space="preserve">• </w:t>
-      </w:r>
-      <w:r>
-        <w:rPr>
-          <w:rFonts w:ascii="Arial" w:cs="Arial" w:eastAsia="Arial" w:hAnsi="Arial"/>
-          <w:color w:val="5A6B66"/>
-          <w:sz w:val="22"/>
-          <w:szCs w:val="22"/>
-        </w:rPr>
-        <w:t xml:space="preserve">Prioridade na busca com IA e nos roteiros</w:t>
-      </w:r>
-    </w:p>
-    <w:p>
-      <w:pPr>
-        <w:spacing w:after="80" w:before="0"/>
-      </w:pPr>
-      <w:r>
-        <w:rPr>
-          <w:rFonts w:ascii="Arial" w:cs="Arial" w:eastAsia="Arial" w:hAnsi="Arial"/>
-          <w:b/>
-          <w:bCs/>
-          <w:color w:val="1A4A3A"/>
-          <w:sz w:val="22"/>
-          <w:szCs w:val="22"/>
-        </w:rPr>
-        <w:t xml:space="preserve">• </w:t>
-      </w:r>
-      <w:r>
-        <w:rPr>
-          <w:rFonts w:ascii="Arial" w:cs="Arial" w:eastAsia="Arial" w:hAnsi="Arial"/>
-          <w:color w:val="5A6B66"/>
-          <w:sz w:val="22"/>
-          <w:szCs w:val="22"/>
-        </w:rPr>
-        <w:t xml:space="preserve">QR Code personalizado + PDF para o balcão</w:t>
-      </w:r>
-    </w:p>
-    <w:p>
-      <w:pPr>
-        <w:spacing w:after="80" w:before="0"/>
-      </w:pPr>
-      <w:r>
-        <w:rPr>
-          <w:rFonts w:ascii="Arial" w:cs="Arial" w:eastAsia="Arial" w:hAnsi="Arial"/>
-          <w:b/>
-          <w:bCs/>
-          <w:color w:val="1A4A3A"/>
-          <w:sz w:val="22"/>
-          <w:szCs w:val="22"/>
-        </w:rPr>
-        <w:t xml:space="preserve">• </w:t>
-      </w:r>
-      <w:r>
-        <w:rPr>
-          <w:rFonts w:ascii="Arial" w:cs="Arial" w:eastAsia="Arial" w:hAnsi="Arial"/>
-          <w:color w:val="5A6B66"/>
-          <w:sz w:val="22"/>
-          <w:szCs w:val="22"/>
-        </w:rPr>
-        <w:t xml:space="preserve">Relatório mensal de visualizações, scans e cliques</w:t>
-      </w:r>
-    </w:p>
-    <w:p>
-      <w:pPr>
-        <w:pBdr>
-          <w:bottom w:val="single" w:color="1A4A3A" w:sz="6"/>
-        </w:pBdr>
-        <w:spacing w:after="200" w:before="200"/>
-      </w:pPr>
-    </w:p>
-    <w:p>
-      <w:pPr>
-        <w:pStyle w:val="Heading2"/>
-        <w:shd w:fill="F0F4F3" w:val="clear"/>
         <w:spacing w:after="140" w:before="240"/>
       </w:pPr>
       <w:r>
@@ -1665,15 +958,17 @@
             <w:vAlign w:val="center"/>
           </w:tcPr>
           <w:p>
+            <w:pPr>
+              <w:spacing w:after="40" w:before="40"/>
+            </w:pPr>
             <w:r>
               <w:rPr>
                 <w:rFonts w:ascii="Arial" w:cs="Arial" w:eastAsia="Arial" w:hAnsi="Arial"/>
-                <w:b/>
-                <w:bCs/>
-                <w:color w:val="1A4A3A"/>
-                <w:sz w:val="20"/>
-                <w:szCs w:val="20"/>
+                <w:color w:val="5A6B66"/>
+                <w:sz w:val="22"/>
+                <w:szCs w:val="22"/>
               </w:rPr>
+              <w:t xml:space="preserve">Item</w:t>
             </w:r>
           </w:p>
         </w:tc>
@@ -1689,15 +984,17 @@
             <w:vAlign w:val="center"/>
           </w:tcPr>
           <w:p>
+            <w:pPr>
+              <w:spacing w:after="40" w:before="40"/>
+            </w:pPr>
             <w:r>
               <w:rPr>
                 <w:rFonts w:ascii="Arial" w:cs="Arial" w:eastAsia="Arial" w:hAnsi="Arial"/>
-                <w:b/>
-                <w:bCs/>
-                <w:color w:val="1A4A3A"/>
-                <w:sz w:val="20"/>
-                <w:szCs w:val="20"/>
+                <w:color w:val="5A6B66"/>
+                <w:sz w:val="22"/>
+                <w:szCs w:val="22"/>
               </w:rPr>
+              <w:t xml:space="preserve">Valor</w:t>
             </w:r>
           </w:p>
         </w:tc>
@@ -1714,15 +1011,17 @@
             <w:vAlign w:val="center"/>
           </w:tcPr>
           <w:p>
+            <w:pPr>
+              <w:spacing w:after="40" w:before="40"/>
+            </w:pPr>
             <w:r>
               <w:rPr>
                 <w:rFonts w:ascii="Arial" w:cs="Arial" w:eastAsia="Arial" w:hAnsi="Arial"/>
-                <w:b/>
-                <w:bCs/>
                 <w:color w:val="5A6B66"/>
-                <w:sz w:val="20"/>
-                <w:szCs w:val="20"/>
+                <w:sz w:val="22"/>
+                <w:szCs w:val="22"/>
               </w:rPr>
+              <w:t xml:space="preserve">Período promocional</w:t>
             </w:r>
           </w:p>
         </w:tc>
@@ -1737,15 +1036,17 @@
             <w:vAlign w:val="center"/>
           </w:tcPr>
           <w:p>
+            <w:pPr>
+              <w:spacing w:after="40" w:before="40"/>
+            </w:pPr>
             <w:r>
               <w:rPr>
                 <w:rFonts w:ascii="Arial" w:cs="Arial" w:eastAsia="Arial" w:hAnsi="Arial"/>
-                <w:b/>
-                <w:bCs/>
                 <w:color w:val="5A6B66"/>
-                <w:sz w:val="20"/>
-                <w:szCs w:val="20"/>
+                <w:sz w:val="22"/>
+                <w:szCs w:val="22"/>
               </w:rPr>
+              <w:t xml:space="preserve">6 (seis) meses a partir da ativação do perfil como Parceiro</w:t>
             </w:r>
           </w:p>
         </w:tc>
@@ -1762,15 +1063,17 @@
             <w:vAlign w:val="center"/>
           </w:tcPr>
           <w:p>
+            <w:pPr>
+              <w:spacing w:after="40" w:before="40"/>
+            </w:pPr>
             <w:r>
               <w:rPr>
                 <w:rFonts w:ascii="Arial" w:cs="Arial" w:eastAsia="Arial" w:hAnsi="Arial"/>
-                <w:b/>
-                <w:bCs/>
                 <w:color w:val="5A6B66"/>
-                <w:sz w:val="20"/>
-                <w:szCs w:val="20"/>
+                <w:sz w:val="22"/>
+                <w:szCs w:val="22"/>
               </w:rPr>
+              <w:t xml:space="preserve">Mensalidade no período</w:t>
             </w:r>
           </w:p>
         </w:tc>
@@ -1785,15 +1088,17 @@
             <w:vAlign w:val="center"/>
           </w:tcPr>
           <w:p>
+            <w:pPr>
+              <w:spacing w:after="40" w:before="40"/>
+            </w:pPr>
             <w:r>
               <w:rPr>
                 <w:rFonts w:ascii="Arial" w:cs="Arial" w:eastAsia="Arial" w:hAnsi="Arial"/>
-                <w:b/>
-                <w:bCs/>
                 <w:color w:val="5A6B66"/>
-                <w:sz w:val="20"/>
-                <w:szCs w:val="20"/>
+                <w:sz w:val="22"/>
+                <w:szCs w:val="22"/>
               </w:rPr>
+              <w:t xml:space="preserve">R$ 0,00 (gratuito)</w:t>
             </w:r>
           </w:p>
         </w:tc>
@@ -1810,15 +1115,17 @@
             <w:vAlign w:val="center"/>
           </w:tcPr>
           <w:p>
+            <w:pPr>
+              <w:spacing w:after="40" w:before="40"/>
+            </w:pPr>
             <w:r>
               <w:rPr>
                 <w:rFonts w:ascii="Arial" w:cs="Arial" w:eastAsia="Arial" w:hAnsi="Arial"/>
-                <w:b/>
-                <w:bCs/>
                 <w:color w:val="5A6B66"/>
-                <w:sz w:val="20"/>
-                <w:szCs w:val="20"/>
+                <w:sz w:val="22"/>
+                <w:szCs w:val="22"/>
               </w:rPr>
+              <w:t xml:space="preserve">Cobrança no período</w:t>
             </w:r>
           </w:p>
         </w:tc>
@@ -1833,15 +1140,17 @@
             <w:vAlign w:val="center"/>
           </w:tcPr>
           <w:p>
+            <w:pPr>
+              <w:spacing w:after="40" w:before="40"/>
+            </w:pPr>
             <w:r>
               <w:rPr>
                 <w:rFonts w:ascii="Arial" w:cs="Arial" w:eastAsia="Arial" w:hAnsi="Arial"/>
-                <w:b/>
-                <w:bCs/>
                 <w:color w:val="5A6B66"/>
-                <w:sz w:val="20"/>
-                <w:szCs w:val="20"/>
+                <w:sz w:val="22"/>
+                <w:szCs w:val="22"/>
               </w:rPr>
+              <w:t xml:space="preserve">Nenhuma — não há cadastro de cartão, PIX recorrente ou boleto durante os 6 meses</w:t>
             </w:r>
           </w:p>
         </w:tc>
@@ -1858,15 +1167,17 @@
             <w:vAlign w:val="center"/>
           </w:tcPr>
           <w:p>
+            <w:pPr>
+              <w:spacing w:after="40" w:before="40"/>
+            </w:pPr>
             <w:r>
               <w:rPr>
                 <w:rFonts w:ascii="Arial" w:cs="Arial" w:eastAsia="Arial" w:hAnsi="Arial"/>
-                <w:b/>
-                <w:bCs/>
                 <w:color w:val="5A6B66"/>
-                <w:sz w:val="20"/>
-                <w:szCs w:val="20"/>
+                <w:sz w:val="22"/>
+                <w:szCs w:val="22"/>
               </w:rPr>
+              <w:t xml:space="preserve">Após o período</w:t>
             </w:r>
           </w:p>
         </w:tc>
@@ -1881,15 +1192,17 @@
             <w:vAlign w:val="center"/>
           </w:tcPr>
           <w:p>
+            <w:pPr>
+              <w:spacing w:after="40" w:before="40"/>
+            </w:pPr>
             <w:r>
               <w:rPr>
                 <w:rFonts w:ascii="Arial" w:cs="Arial" w:eastAsia="Arial" w:hAnsi="Arial"/>
-                <w:b/>
-                <w:bCs/>
                 <w:color w:val="5A6B66"/>
-                <w:sz w:val="20"/>
-                <w:szCs w:val="20"/>
+                <w:sz w:val="22"/>
+                <w:szCs w:val="22"/>
               </w:rPr>
+              <w:t xml:space="preserve">Encerramento automático dos benefícios de Parceiro, salvo adesão expressa ao plano pago</w:t>
             </w:r>
           </w:p>
         </w:tc>
@@ -1911,7 +1224,6 @@
     <w:p>
       <w:pPr>
         <w:pStyle w:val="Heading2"/>
-        <w:shd w:fill="F0F4F3" w:val="clear"/>
         <w:spacing w:after="140" w:before="240"/>
       </w:pPr>
       <w:r>
@@ -1955,15 +1267,17 @@
             <w:vAlign w:val="center"/>
           </w:tcPr>
           <w:p>
+            <w:pPr>
+              <w:spacing w:after="40" w:before="40"/>
+            </w:pPr>
             <w:r>
               <w:rPr>
                 <w:rFonts w:ascii="Arial" w:cs="Arial" w:eastAsia="Arial" w:hAnsi="Arial"/>
-                <w:b/>
-                <w:bCs/>
-                <w:color w:val="1A4A3A"/>
-                <w:sz w:val="20"/>
-                <w:szCs w:val="20"/>
+                <w:color w:val="5A6B66"/>
+                <w:sz w:val="22"/>
+                <w:szCs w:val="22"/>
               </w:rPr>
+              <w:t xml:space="preserve">Opção</w:t>
             </w:r>
           </w:p>
         </w:tc>
@@ -1979,15 +1293,17 @@
             <w:vAlign w:val="center"/>
           </w:tcPr>
           <w:p>
+            <w:pPr>
+              <w:spacing w:after="40" w:before="40"/>
+            </w:pPr>
             <w:r>
               <w:rPr>
                 <w:rFonts w:ascii="Arial" w:cs="Arial" w:eastAsia="Arial" w:hAnsi="Arial"/>
-                <w:b/>
-                <w:bCs/>
-                <w:color w:val="1A4A3A"/>
-                <w:sz w:val="20"/>
-                <w:szCs w:val="20"/>
+                <w:color w:val="5A6B66"/>
+                <w:sz w:val="22"/>
+                <w:szCs w:val="22"/>
               </w:rPr>
+              <w:t xml:space="preserve">Descrição</w:t>
             </w:r>
           </w:p>
         </w:tc>
@@ -2004,15 +1320,17 @@
             <w:vAlign w:val="center"/>
           </w:tcPr>
           <w:p>
+            <w:pPr>
+              <w:spacing w:after="40" w:before="40"/>
+            </w:pPr>
             <w:r>
               <w:rPr>
                 <w:rFonts w:ascii="Arial" w:cs="Arial" w:eastAsia="Arial" w:hAnsi="Arial"/>
-                <w:b/>
-                <w:bCs/>
                 <w:color w:val="5A6B66"/>
-                <w:sz w:val="20"/>
-                <w:szCs w:val="20"/>
+                <w:sz w:val="22"/>
+                <w:szCs w:val="22"/>
               </w:rPr>
+              <w:t xml:space="preserve">A — Não continuar</w:t>
             </w:r>
           </w:p>
         </w:tc>
@@ -2027,15 +1345,17 @@
             <w:vAlign w:val="center"/>
           </w:tcPr>
           <w:p>
+            <w:pPr>
+              <w:spacing w:after="40" w:before="40"/>
+            </w:pPr>
             <w:r>
               <w:rPr>
                 <w:rFonts w:ascii="Arial" w:cs="Arial" w:eastAsia="Arial" w:hAnsi="Arial"/>
-                <w:b/>
-                <w:bCs/>
                 <w:color w:val="5A6B66"/>
-                <w:sz w:val="20"/>
-                <w:szCs w:val="20"/>
+                <w:sz w:val="22"/>
+                <w:szCs w:val="22"/>
               </w:rPr>
+              <w:t xml:space="preserve">Basta não aderir ao plano pago ou enviar e-mail de encerramento (ver Cláusula 2.3 do Contrato). Os benefícios de Parceiro cessam; o perfil pode permanecer no guia em formato básico ou ser removido, conforme comunicação da equipe. Sem multa e sem cobrança.</w:t>
             </w:r>
           </w:p>
         </w:tc>
@@ -2052,15 +1372,17 @@
             <w:vAlign w:val="center"/>
           </w:tcPr>
           <w:p>
+            <w:pPr>
+              <w:spacing w:after="40" w:before="40"/>
+            </w:pPr>
             <w:r>
               <w:rPr>
                 <w:rFonts w:ascii="Arial" w:cs="Arial" w:eastAsia="Arial" w:hAnsi="Arial"/>
-                <w:b/>
-                <w:bCs/>
                 <w:color w:val="5A6B66"/>
-                <w:sz w:val="20"/>
-                <w:szCs w:val="20"/>
+                <w:sz w:val="22"/>
+                <w:szCs w:val="22"/>
               </w:rPr>
+              <w:t xml:space="preserve">B — Continuar como Parceiro</w:t>
             </w:r>
           </w:p>
         </w:tc>
@@ -2075,35 +1397,36 @@
             <w:vAlign w:val="center"/>
           </w:tcPr>
           <w:p>
+            <w:pPr>
+              <w:spacing w:after="40" w:before="40"/>
+            </w:pPr>
             <w:r>
               <w:rPr>
                 <w:rFonts w:ascii="Arial" w:cs="Arial" w:eastAsia="Arial" w:hAnsi="Arial"/>
-                <w:b/>
-                <w:bCs/>
                 <w:color w:val="5A6B66"/>
-                <w:sz w:val="20"/>
-                <w:szCs w:val="20"/>
+                <w:sz w:val="22"/>
+                <w:szCs w:val="22"/>
               </w:rPr>
+              <w:t xml:space="preserve">Adesão expressa ao Plano Parceiro a R$ 299,00 (duzentos e noventa e nove reais) por mês, mediante assinatura do </w:t>
             </w:r>
             <w:r>
               <w:rPr>
                 <w:rFonts w:ascii="Arial" w:cs="Arial" w:eastAsia="Arial" w:hAnsi="Arial"/>
-                <w:b/>
-                <w:bCs/>
-                <w:color w:val="5A6B66"/>
-                <w:sz w:val="20"/>
-                <w:szCs w:val="20"/>
+                <w:color w:val="1A4A3A"/>
+                <w:sz w:val="22"/>
+                <w:szCs w:val="22"/>
+                <w:u w:val="single"/>
               </w:rPr>
+              <w:t xml:space="preserve">contrato comercial padrão</w:t>
             </w:r>
             <w:r>
               <w:rPr>
                 <w:rFonts w:ascii="Arial" w:cs="Arial" w:eastAsia="Arial" w:hAnsi="Arial"/>
-                <w:b/>
-                <w:bCs/>
                 <w:color w:val="5A6B66"/>
-                <w:sz w:val="20"/>
-                <w:szCs w:val="20"/>
+                <w:sz w:val="22"/>
+                <w:szCs w:val="22"/>
               </w:rPr>
+              <w:t xml:space="preserve"> ou termo aditivo e cadastro de pagamento no Asaas (PIX, boleto ou cartão).</w:t>
             </w:r>
           </w:p>
         </w:tc>
@@ -2159,7 +1482,6 @@
     <w:p>
       <w:pPr>
         <w:pStyle w:val="Heading2"/>
-        <w:shd w:fill="F0F4F3" w:val="clear"/>
         <w:spacing w:after="140" w:before="240"/>
       </w:pPr>
       <w:r>
@@ -2203,15 +1525,17 @@
             <w:vAlign w:val="center"/>
           </w:tcPr>
           <w:p>
+            <w:pPr>
+              <w:spacing w:after="40" w:before="40"/>
+            </w:pPr>
             <w:r>
               <w:rPr>
                 <w:rFonts w:ascii="Arial" w:cs="Arial" w:eastAsia="Arial" w:hAnsi="Arial"/>
-                <w:b/>
-                <w:bCs/>
-                <w:color w:val="1A4A3A"/>
-                <w:sz w:val="20"/>
-                <w:szCs w:val="20"/>
+                <w:color w:val="5A6B66"/>
+                <w:sz w:val="22"/>
+                <w:szCs w:val="22"/>
               </w:rPr>
+              <w:t xml:space="preserve">Etapa</w:t>
             </w:r>
           </w:p>
         </w:tc>
@@ -2227,15 +1551,17 @@
             <w:vAlign w:val="center"/>
           </w:tcPr>
           <w:p>
+            <w:pPr>
+              <w:spacing w:after="40" w:before="40"/>
+            </w:pPr>
             <w:r>
               <w:rPr>
                 <w:rFonts w:ascii="Arial" w:cs="Arial" w:eastAsia="Arial" w:hAnsi="Arial"/>
-                <w:b/>
-                <w:bCs/>
-                <w:color w:val="1A4A3A"/>
-                <w:sz w:val="20"/>
-                <w:szCs w:val="20"/>
+                <w:color w:val="5A6B66"/>
+                <w:sz w:val="22"/>
+                <w:szCs w:val="22"/>
               </w:rPr>
+              <w:t xml:space="preserve">Descrição</w:t>
             </w:r>
           </w:p>
         </w:tc>
@@ -2252,15 +1578,17 @@
             <w:vAlign w:val="center"/>
           </w:tcPr>
           <w:p>
+            <w:pPr>
+              <w:spacing w:after="40" w:before="40"/>
+            </w:pPr>
             <w:r>
               <w:rPr>
                 <w:rFonts w:ascii="Arial" w:cs="Arial" w:eastAsia="Arial" w:hAnsi="Arial"/>
-                <w:b/>
-                <w:bCs/>
                 <w:color w:val="5A6B66"/>
-                <w:sz w:val="20"/>
-                <w:szCs w:val="20"/>
+                <w:sz w:val="22"/>
+                <w:szCs w:val="22"/>
               </w:rPr>
+              <w:t xml:space="preserve">01 — Visita e assinatura</w:t>
             </w:r>
           </w:p>
         </w:tc>
@@ -2275,15 +1603,17 @@
             <w:vAlign w:val="center"/>
           </w:tcPr>
           <w:p>
+            <w:pPr>
+              <w:spacing w:after="40" w:before="40"/>
+            </w:pPr>
             <w:r>
               <w:rPr>
                 <w:rFonts w:ascii="Arial" w:cs="Arial" w:eastAsia="Arial" w:hAnsi="Arial"/>
-                <w:b w:val="false"/>
-                <w:bCs w:val="false"/>
                 <w:color w:val="5A6B66"/>
-                <w:sz w:val="20"/>
-                <w:szCs w:val="20"/>
+                <w:sz w:val="22"/>
+                <w:szCs w:val="22"/>
               </w:rPr>
+              <w:t xml:space="preserve">Apresentação do app, assinatura deste Contrato (2 vias) e preenchimento do Anexo II</w:t>
             </w:r>
           </w:p>
         </w:tc>
@@ -2300,15 +1630,17 @@
             <w:vAlign w:val="center"/>
           </w:tcPr>
           <w:p>
+            <w:pPr>
+              <w:spacing w:after="40" w:before="40"/>
+            </w:pPr>
             <w:r>
               <w:rPr>
                 <w:rFonts w:ascii="Arial" w:cs="Arial" w:eastAsia="Arial" w:hAnsi="Arial"/>
-                <w:b/>
-                <w:bCs/>
                 <w:color w:val="5A6B66"/>
-                <w:sz w:val="20"/>
-                <w:szCs w:val="20"/>
+                <w:sz w:val="22"/>
+                <w:szCs w:val="22"/>
               </w:rPr>
+              <w:t xml:space="preserve">02 — Materiais</w:t>
             </w:r>
           </w:p>
         </w:tc>
@@ -2323,15 +1655,17 @@
             <w:vAlign w:val="center"/>
           </w:tcPr>
           <w:p>
+            <w:pPr>
+              <w:spacing w:after="40" w:before="40"/>
+            </w:pPr>
             <w:r>
               <w:rPr>
                 <w:rFonts w:ascii="Arial" w:cs="Arial" w:eastAsia="Arial" w:hAnsi="Arial"/>
-                <w:b w:val="false"/>
-                <w:bCs w:val="false"/>
                 <w:color w:val="5A6B66"/>
-                <w:sz w:val="20"/>
-                <w:szCs w:val="20"/>
+                <w:sz w:val="22"/>
+                <w:szCs w:val="22"/>
               </w:rPr>
+              <w:t xml:space="preserve">Fotos, horários, endereço e links enviados na visita ou em até 7 dias</w:t>
             </w:r>
           </w:p>
         </w:tc>
@@ -2348,15 +1682,17 @@
             <w:vAlign w:val="center"/>
           </w:tcPr>
           <w:p>
+            <w:pPr>
+              <w:spacing w:after="40" w:before="40"/>
+            </w:pPr>
             <w:r>
               <w:rPr>
                 <w:rFonts w:ascii="Arial" w:cs="Arial" w:eastAsia="Arial" w:hAnsi="Arial"/>
-                <w:b/>
-                <w:bCs/>
                 <w:color w:val="5A6B66"/>
-                <w:sz w:val="20"/>
-                <w:szCs w:val="20"/>
+                <w:sz w:val="22"/>
+                <w:szCs w:val="22"/>
               </w:rPr>
+              <w:t xml:space="preserve">03 — Ativação</w:t>
             </w:r>
           </w:p>
         </w:tc>
@@ -2371,15 +1707,17 @@
             <w:vAlign w:val="center"/>
           </w:tcPr>
           <w:p>
+            <w:pPr>
+              <w:spacing w:after="40" w:before="40"/>
+            </w:pPr>
             <w:r>
               <w:rPr>
                 <w:rFonts w:ascii="Arial" w:cs="Arial" w:eastAsia="Arial" w:hAnsi="Arial"/>
-                <w:b/>
-                <w:bCs/>
                 <w:color w:val="5A6B66"/>
-                <w:sz w:val="20"/>
-                <w:szCs w:val="20"/>
+                <w:sz w:val="22"/>
+                <w:szCs w:val="22"/>
               </w:rPr>
+              <w:t xml:space="preserve">Perfil publicado e ativado como Parceiro em até 7 dias úteis</w:t>
             </w:r>
           </w:p>
         </w:tc>
@@ -2396,15 +1734,17 @@
             <w:vAlign w:val="center"/>
           </w:tcPr>
           <w:p>
+            <w:pPr>
+              <w:spacing w:after="40" w:before="40"/>
+            </w:pPr>
             <w:r>
               <w:rPr>
                 <w:rFonts w:ascii="Arial" w:cs="Arial" w:eastAsia="Arial" w:hAnsi="Arial"/>
-                <w:b/>
-                <w:bCs/>
                 <w:color w:val="5A6B66"/>
-                <w:sz w:val="20"/>
-                <w:szCs w:val="20"/>
+                <w:sz w:val="22"/>
+                <w:szCs w:val="22"/>
               </w:rPr>
+              <w:t xml:space="preserve">04 — Acompanhamento</w:t>
             </w:r>
           </w:p>
         </w:tc>
@@ -2419,15 +1759,17 @@
             <w:vAlign w:val="center"/>
           </w:tcPr>
           <w:p>
+            <w:pPr>
+              <w:spacing w:after="40" w:before="40"/>
+            </w:pPr>
             <w:r>
               <w:rPr>
                 <w:rFonts w:ascii="Arial" w:cs="Arial" w:eastAsia="Arial" w:hAnsi="Arial"/>
-                <w:b w:val="false"/>
-                <w:bCs w:val="false"/>
                 <w:color w:val="5A6B66"/>
-                <w:sz w:val="20"/>
-                <w:szCs w:val="20"/>
+                <w:sz w:val="22"/>
+                <w:szCs w:val="22"/>
               </w:rPr>
+              <w:t xml:space="preserve">Relatórios mensais durante os 6 meses; contato da equipe antes do fim do período</w:t>
             </w:r>
           </w:p>
         </w:tc>
@@ -2449,7 +1791,6 @@
     <w:p>
       <w:pPr>
         <w:pStyle w:val="Heading2"/>
-        <w:shd w:fill="F0F4F3" w:val="clear"/>
         <w:spacing w:after="140" w:before="240"/>
       </w:pPr>
       <w:r>
@@ -2477,7 +1818,7 @@
           <w:sz w:val="22"/>
           <w:szCs w:val="22"/>
         </w:rPr>
-        <w:t xml:space="preserve">• </w:t>
+        <w:t xml:space="preserve">1. </w:t>
       </w:r>
       <w:r>
         <w:rPr>
@@ -2522,7 +1863,7 @@
           <w:sz w:val="22"/>
           <w:szCs w:val="22"/>
         </w:rPr>
-        <w:t xml:space="preserve">• </w:t>
+        <w:t xml:space="preserve">2. </w:t>
       </w:r>
       <w:r>
         <w:rPr>
@@ -2567,7 +1908,7 @@
           <w:sz w:val="22"/>
           <w:szCs w:val="22"/>
         </w:rPr>
-        <w:t xml:space="preserve">• </w:t>
+        <w:t xml:space="preserve">3. </w:t>
       </w:r>
       <w:r>
         <w:rPr>
@@ -2592,7 +1933,7 @@
           <w:sz w:val="22"/>
           <w:szCs w:val="22"/>
         </w:rPr>
-        <w:t xml:space="preserve">• </w:t>
+        <w:t xml:space="preserve">4. </w:t>
       </w:r>
       <w:r>
         <w:rPr>
@@ -2617,7 +1958,7 @@
           <w:sz w:val="22"/>
           <w:szCs w:val="22"/>
         </w:rPr>
-        <w:t xml:space="preserve">• </w:t>
+        <w:t xml:space="preserve">5. </w:t>
       </w:r>
       <w:r>
         <w:rPr>
@@ -2683,21 +2024,6 @@
       </w:pPr>
     </w:p>
     <w:p>
-      <w:pPr>
-        <w:spacing w:after="200" w:before="0"/>
-      </w:pPr>
-    </w:p>
-    <w:p>
-      <w:pPr>
-        <w:spacing w:after="200" w:before="0"/>
-      </w:pPr>
-    </w:p>
-    <w:p>
-      <w:pPr>
-        <w:spacing w:after="200" w:before="0"/>
-      </w:pPr>
-    </w:p>
-    <w:p>
       <w:r>
         <w:br w:type="page"/>
       </w:r>
@@ -2722,7 +2048,6 @@
     <w:p>
       <w:pPr>
         <w:pStyle w:val="Heading2"/>
-        <w:shd w:fill="F0F4F3" w:val="clear"/>
         <w:spacing w:after="140" w:before="240"/>
       </w:pPr>
       <w:r>
@@ -4102,79 +3427,6 @@
           <w:sz w:val="22"/>
           <w:szCs w:val="22"/>
         </w:rPr>
-        <w:t xml:space="preserve">b) Aderir ao </w:t>
-      </w:r>
-      <w:r>
-        <w:rPr>
-          <w:rFonts w:ascii="Arial" w:cs="Arial" w:eastAsia="Arial" w:hAnsi="Arial"/>
-          <w:b/>
-          <w:bCs/>
-          <w:color w:val="1A2E28"/>
-          <w:sz w:val="22"/>
-          <w:szCs w:val="22"/>
-        </w:rPr>
-        <w:t xml:space="preserve">Plano Parceiro pago</w:t>
-      </w:r>
-      <w:r>
-        <w:rPr>
-          <w:rFonts w:ascii="Arial" w:cs="Arial" w:eastAsia="Arial" w:hAnsi="Arial"/>
-          <w:color w:val="5A6B66"/>
-          <w:sz w:val="22"/>
-          <w:szCs w:val="22"/>
-        </w:rPr>
-        <w:t xml:space="preserve"> a </w:t>
-      </w:r>
-      <w:r>
-        <w:rPr>
-          <w:rFonts w:ascii="Arial" w:cs="Arial" w:eastAsia="Arial" w:hAnsi="Arial"/>
-          <w:b/>
-          <w:bCs/>
-          <w:color w:val="1A2E28"/>
-          <w:sz w:val="22"/>
-          <w:szCs w:val="22"/>
-        </w:rPr>
-        <w:t xml:space="preserve">R$ 299,00 (duzentos e noventa e nove reais) por mês</w:t>
-      </w:r>
-      <w:r>
-        <w:rPr>
-          <w:rFonts w:ascii="Arial" w:cs="Arial" w:eastAsia="Arial" w:hAnsi="Arial"/>
-          <w:color w:val="5A6B66"/>
-          <w:sz w:val="22"/>
-          <w:szCs w:val="22"/>
-        </w:rPr>
-        <w:t xml:space="preserve">, nas condições do </w:t>
-      </w:r>
-      <w:r>
-        <w:rPr>
-          <w:rFonts w:ascii="Arial" w:cs="Arial" w:eastAsia="Arial" w:hAnsi="Arial"/>
-          <w:color w:val="1A4A3A"/>
-          <w:sz w:val="22"/>
-          <w:szCs w:val="22"/>
-          <w:u w:val="single"/>
-        </w:rPr>
-        <w:t xml:space="preserve">Contrato de Prestação de Serviços — Plano Parceiro</w:t>
-      </w:r>
-      <w:r>
-        <w:rPr>
-          <w:rFonts w:ascii="Arial" w:cs="Arial" w:eastAsia="Arial" w:hAnsi="Arial"/>
-          <w:color w:val="5A6B66"/>
-          <w:sz w:val="22"/>
-          <w:szCs w:val="22"/>
-        </w:rPr>
-        <w:t xml:space="preserve"> (cobrança via Asaas, vencimento dia 10, aviso prévio de 30 dias para rescisão).</w:t>
-      </w:r>
-    </w:p>
-    <w:p>
-      <w:pPr>
-        <w:spacing w:after="140" w:before="0"/>
-      </w:pPr>
-      <w:r>
-        <w:rPr>
-          <w:rFonts w:ascii="Arial" w:cs="Arial" w:eastAsia="Arial" w:hAnsi="Arial"/>
-          <w:color w:val="5A6B66"/>
-          <w:sz w:val="22"/>
-          <w:szCs w:val="22"/>
-        </w:rPr>
         <w:t xml:space="preserve">3.5. Sem adesão expressa à Cláusula 3.4, </w:t>
       </w:r>
       <w:r>
@@ -4971,6 +4223,7 @@
       <w:r>
         <w:rPr>
           <w:rFonts w:ascii="Arial" w:cs="Arial" w:eastAsia="Arial" w:hAnsi="Arial"/>
+          <w:color w:val="5A6B66"/>
           <w:sz w:val="22"/>
           <w:szCs w:val="22"/>
           <w:u w:val="single"/>
@@ -4980,6 +4233,7 @@
       <w:r>
         <w:rPr>
           <w:rFonts w:ascii="Arial" w:cs="Arial" w:eastAsia="Arial" w:hAnsi="Arial"/>
+          <w:color w:val="5A6B66"/>
           <w:sz w:val="22"/>
           <w:szCs w:val="22"/>
           <w:u w:val="single"/>
@@ -4998,16 +4252,6 @@
     </w:p>
     <w:p>
       <w:pPr>
-        <w:spacing w:after="200" w:before="0"/>
-      </w:pPr>
-    </w:p>
-    <w:p>
-      <w:pPr>
-        <w:spacing w:after="200" w:before="0"/>
-      </w:pPr>
-    </w:p>
-    <w:p>
-      <w:pPr>
         <w:spacing w:after="140" w:before="0"/>
       </w:pPr>
       <w:r>
@@ -5063,16 +4307,6 @@
         </w:rPr>
         <w:t xml:space="preserve">ESTABELECIMENTO</w:t>
       </w:r>
-    </w:p>
-    <w:p>
-      <w:pPr>
-        <w:spacing w:after="200" w:before="0"/>
-      </w:pPr>
-    </w:p>
-    <w:p>
-      <w:pPr>
-        <w:spacing w:after="200" w:before="0"/>
-      </w:pPr>
     </w:p>
     <w:p>
       <w:pPr>
@@ -5164,16 +4398,6 @@
       </w:pPr>
     </w:p>
     <w:p>
-      <w:pPr>
-        <w:spacing w:after="200" w:before="0"/>
-      </w:pPr>
-    </w:p>
-    <w:p>
-      <w:pPr>
-        <w:spacing w:after="200" w:before="0"/>
-      </w:pPr>
-    </w:p>
-    <w:p>
       <w:r>
         <w:br w:type="page"/>
       </w:r>
@@ -5252,7 +4476,6 @@
     <w:p>
       <w:pPr>
         <w:pStyle w:val="Heading2"/>
-        <w:shd w:fill="F0F4F3" w:val="clear"/>
         <w:spacing w:after="140" w:before="240"/>
       </w:pPr>
       <w:r>
@@ -5280,7 +4503,7 @@
           <w:sz w:val="22"/>
           <w:szCs w:val="22"/>
         </w:rPr>
-        <w:t xml:space="preserve">• </w:t>
+        <w:t xml:space="preserve">1. </w:t>
       </w:r>
       <w:r>
         <w:rPr>
@@ -5305,7 +4528,7 @@
           <w:sz w:val="22"/>
           <w:szCs w:val="22"/>
         </w:rPr>
-        <w:t xml:space="preserve">• </w:t>
+        <w:t xml:space="preserve">2. </w:t>
       </w:r>
       <w:r>
         <w:rPr>
@@ -5330,7 +4553,7 @@
           <w:sz w:val="22"/>
           <w:szCs w:val="22"/>
         </w:rPr>
-        <w:t xml:space="preserve">• </w:t>
+        <w:t xml:space="preserve">3. </w:t>
       </w:r>
       <w:r>
         <w:rPr>
@@ -5355,7 +4578,7 @@
           <w:sz w:val="22"/>
           <w:szCs w:val="22"/>
         </w:rPr>
-        <w:t xml:space="preserve">• </w:t>
+        <w:t xml:space="preserve">4. </w:t>
       </w:r>
       <w:r>
         <w:rPr>
@@ -5380,7 +4603,7 @@
           <w:sz w:val="22"/>
           <w:szCs w:val="22"/>
         </w:rPr>
-        <w:t xml:space="preserve">• </w:t>
+        <w:t xml:space="preserve">5. </w:t>
       </w:r>
       <w:r>
         <w:rPr>
@@ -5405,7 +4628,7 @@
           <w:sz w:val="22"/>
           <w:szCs w:val="22"/>
         </w:rPr>
-        <w:t xml:space="preserve">• </w:t>
+        <w:t xml:space="preserve">6. </w:t>
       </w:r>
       <w:r>
         <w:rPr>
@@ -5430,7 +4653,7 @@
           <w:sz w:val="22"/>
           <w:szCs w:val="22"/>
         </w:rPr>
-        <w:t xml:space="preserve">• </w:t>
+        <w:t xml:space="preserve">7. </w:t>
       </w:r>
       <w:r>
         <w:rPr>
@@ -5455,7 +4678,7 @@
           <w:sz w:val="22"/>
           <w:szCs w:val="22"/>
         </w:rPr>
-        <w:t xml:space="preserve">• </w:t>
+        <w:t xml:space="preserve">8. </w:t>
       </w:r>
       <w:r>
         <w:rPr>
@@ -5480,7 +4703,7 @@
           <w:sz w:val="22"/>
           <w:szCs w:val="22"/>
         </w:rPr>
-        <w:t xml:space="preserve">• </w:t>
+        <w:t xml:space="preserve">9. </w:t>
       </w:r>
       <w:r>
         <w:rPr>
@@ -5505,7 +4728,7 @@
           <w:sz w:val="22"/>
           <w:szCs w:val="22"/>
         </w:rPr>
-        <w:t xml:space="preserve">• </w:t>
+        <w:t xml:space="preserve">10. </w:t>
       </w:r>
       <w:r>
         <w:rPr>
@@ -5530,7 +4753,7 @@
           <w:sz w:val="22"/>
           <w:szCs w:val="22"/>
         </w:rPr>
-        <w:t xml:space="preserve">• </w:t>
+        <w:t xml:space="preserve">11. </w:t>
       </w:r>
       <w:r>
         <w:rPr>
@@ -5545,7 +4768,6 @@
     <w:p>
       <w:pPr>
         <w:pStyle w:val="Heading2"/>
-        <w:shd w:fill="F0F4F3" w:val="clear"/>
         <w:spacing w:after="140" w:before="240"/>
       </w:pPr>
       <w:r>
@@ -5617,7 +4839,6 @@
     <w:p>
       <w:pPr>
         <w:pStyle w:val="Heading2"/>
-        <w:shd w:fill="F0F4F3" w:val="clear"/>
         <w:spacing w:after="140" w:before="240"/>
       </w:pPr>
       <w:r>
@@ -5717,6 +4938,36 @@
     </w:p>
     <w:p>
       <w:pPr>
+        <w:pBdr>
+          <w:bottom w:val="single" w:color="1A4A3A" w:sz="6"/>
+        </w:pBdr>
+        <w:spacing w:after="200" w:before="200"/>
+      </w:pPr>
+    </w:p>
+    <w:p>
+      <w:r>
+        <w:br w:type="page"/>
+      </w:r>
+    </w:p>
+    <w:p>
+      <w:pPr>
+        <w:pStyle w:val="Heading1"/>
+        <w:spacing w:after="200" w:before="280"/>
+      </w:pPr>
+      <w:r>
+        <w:rPr>
+          <w:rFonts w:ascii="Arial" w:cs="Arial" w:eastAsia="Arial" w:hAnsi="Arial"/>
+          <w:b/>
+          <w:bCs/>
+          <w:color w:val="1A4A3A"/>
+          <w:sz w:val="32"/>
+          <w:szCs w:val="32"/>
+        </w:rPr>
+        <w:t xml:space="preserve">ANEXO II — DADOS DO ESTABELECIMENTO (CONTRATANTE)</w:t>
+      </w:r>
+    </w:p>
+    <w:p>
+      <w:pPr>
         <w:spacing w:after="140" w:before="0"/>
       </w:pPr>
       <w:r>
@@ -5728,24 +4979,1499 @@
           <w:sz w:val="22"/>
           <w:szCs w:val="22"/>
         </w:rPr>
-        <w:t xml:space="preserve">Anexos II e III: utilizar os mesmos do [MODELO-CONTRATO-PARCEIRO-GUIA-DE-BOLSO.md](./MODELO-CONTRATO-PARCEIRO-GUIA-DE-BOLSO.md).</w:t>
-      </w:r>
-    </w:p>
-    <w:p>
-      <w:pPr>
-        <w:spacing w:after="140" w:before="0"/>
-      </w:pPr>
-      <w:r>
-        <w:rPr>
-          <w:rFonts w:ascii="Arial" w:cs="Arial" w:eastAsia="Arial" w:hAnsi="Arial"/>
-          <w:i/>
-          <w:iCs/>
-          <w:color w:val="5A6B66"/>
-          <w:sz w:val="22"/>
-          <w:szCs w:val="22"/>
-        </w:rPr>
-        <w:t xml:space="preserve">Fim do documento — Guia de Bolso · contato@guiadebolso.app</w:t>
-      </w:r>
+        <w:t xml:space="preserve">Preencher na reunião ou anexar à via assinada do contrato.</w:t>
+      </w:r>
+    </w:p>
+    <w:tbl>
+      <w:tblPr>
+        <w:tblW w:type="pct" w:w="100%"/>
+        <w:tblBorders>
+          <w:top w:val="single" w:color="auto" w:sz="4"/>
+          <w:left w:val="single" w:color="auto" w:sz="4"/>
+          <w:bottom w:val="single" w:color="auto" w:sz="4"/>
+          <w:right w:val="single" w:color="auto" w:sz="4"/>
+          <w:insideH w:val="single" w:color="auto" w:sz="4"/>
+          <w:insideV w:val="single" w:color="auto" w:sz="4"/>
+        </w:tblBorders>
+      </w:tblPr>
+      <w:tblGrid>
+        <w:gridCol w:w="100"/>
+        <w:gridCol w:w="100"/>
+      </w:tblGrid>
+      <w:tr>
+        <w:tc>
+          <w:tcPr>
+            <w:shd w:fill="F0F4F3" w:val="clear"/>
+            <w:tcMar>
+              <w:top w:type="dxa" w:w="80"/>
+              <w:left w:type="dxa" w:w="120"/>
+              <w:bottom w:type="dxa" w:w="80"/>
+              <w:right w:type="dxa" w:w="120"/>
+            </w:tcMar>
+            <w:vAlign w:val="center"/>
+          </w:tcPr>
+          <w:p>
+            <w:pPr>
+              <w:spacing w:after="40" w:before="40"/>
+            </w:pPr>
+            <w:r>
+              <w:rPr>
+                <w:rFonts w:ascii="Arial" w:cs="Arial" w:eastAsia="Arial" w:hAnsi="Arial"/>
+                <w:color w:val="5A6B66"/>
+                <w:sz w:val="22"/>
+                <w:szCs w:val="22"/>
+              </w:rPr>
+              <w:t xml:space="preserve">Campo</w:t>
+            </w:r>
+          </w:p>
+        </w:tc>
+        <w:tc>
+          <w:tcPr>
+            <w:shd w:fill="F0F4F3" w:val="clear"/>
+            <w:tcMar>
+              <w:top w:type="dxa" w:w="80"/>
+              <w:left w:type="dxa" w:w="120"/>
+              <w:bottom w:type="dxa" w:w="80"/>
+              <w:right w:type="dxa" w:w="120"/>
+            </w:tcMar>
+            <w:vAlign w:val="center"/>
+          </w:tcPr>
+          <w:p>
+            <w:pPr>
+              <w:spacing w:after="40" w:before="40"/>
+            </w:pPr>
+            <w:r>
+              <w:rPr>
+                <w:rFonts w:ascii="Arial" w:cs="Arial" w:eastAsia="Arial" w:hAnsi="Arial"/>
+                <w:color w:val="5A6B66"/>
+                <w:sz w:val="22"/>
+                <w:szCs w:val="22"/>
+              </w:rPr>
+              <w:t xml:space="preserve">Informação</w:t>
+            </w:r>
+          </w:p>
+        </w:tc>
+      </w:tr>
+      <w:tr>
+        <w:tc>
+          <w:tcPr>
+            <w:tcMar>
+              <w:top w:type="dxa" w:w="80"/>
+              <w:left w:type="dxa" w:w="120"/>
+              <w:bottom w:type="dxa" w:w="80"/>
+              <w:right w:type="dxa" w:w="120"/>
+            </w:tcMar>
+            <w:vAlign w:val="center"/>
+          </w:tcPr>
+          <w:p>
+            <w:pPr>
+              <w:spacing w:after="40" w:before="40"/>
+            </w:pPr>
+            <w:r>
+              <w:rPr>
+                <w:rFonts w:ascii="Arial" w:cs="Arial" w:eastAsia="Arial" w:hAnsi="Arial"/>
+                <w:color w:val="5A6B66"/>
+                <w:sz w:val="22"/>
+                <w:szCs w:val="22"/>
+              </w:rPr>
+              <w:t xml:space="preserve">Nº da proposta / contrato</w:t>
+            </w:r>
+          </w:p>
+        </w:tc>
+        <w:tc>
+          <w:tcPr>
+            <w:tcMar>
+              <w:top w:type="dxa" w:w="80"/>
+              <w:left w:type="dxa" w:w="120"/>
+              <w:bottom w:type="dxa" w:w="80"/>
+              <w:right w:type="dxa" w:w="120"/>
+            </w:tcMar>
+            <w:vAlign w:val="center"/>
+          </w:tcPr>
+          <w:p>
+            <w:pPr>
+              <w:spacing w:after="40" w:before="40"/>
+            </w:pPr>
+            <w:r>
+              <w:rPr>
+                <w:rFonts w:ascii="Arial" w:cs="Arial" w:eastAsia="Arial" w:hAnsi="Arial"/>
+                <w:color w:val="5A6B66"/>
+                <w:sz w:val="22"/>
+                <w:szCs w:val="22"/>
+              </w:rPr>
+              <w:t xml:space="preserve"> / 2026</w:t>
+            </w:r>
+          </w:p>
+        </w:tc>
+      </w:tr>
+      <w:tr>
+        <w:tc>
+          <w:tcPr>
+            <w:tcMar>
+              <w:top w:type="dxa" w:w="80"/>
+              <w:left w:type="dxa" w:w="120"/>
+              <w:bottom w:type="dxa" w:w="80"/>
+              <w:right w:type="dxa" w:w="120"/>
+            </w:tcMar>
+            <w:vAlign w:val="center"/>
+          </w:tcPr>
+          <w:p>
+            <w:pPr>
+              <w:spacing w:after="40" w:before="40"/>
+            </w:pPr>
+            <w:r>
+              <w:rPr>
+                <w:rFonts w:ascii="Arial" w:cs="Arial" w:eastAsia="Arial" w:hAnsi="Arial"/>
+                <w:color w:val="5A6B66"/>
+                <w:sz w:val="22"/>
+                <w:szCs w:val="22"/>
+              </w:rPr>
+              <w:t xml:space="preserve">Nome fantasia do estabelecimento</w:t>
+            </w:r>
+          </w:p>
+        </w:tc>
+        <w:tc>
+          <w:tcPr>
+            <w:tcMar>
+              <w:top w:type="dxa" w:w="80"/>
+              <w:left w:type="dxa" w:w="120"/>
+              <w:bottom w:type="dxa" w:w="80"/>
+              <w:right w:type="dxa" w:w="120"/>
+            </w:tcMar>
+            <w:vAlign w:val="center"/>
+          </w:tcPr>
+          <w:p>
+            <w:pPr>
+              <w:spacing w:after="40" w:before="40"/>
+            </w:pPr>
+            <w:r>
+              <w:rPr>
+                <w:rFonts w:ascii="Arial" w:cs="Arial" w:eastAsia="Arial" w:hAnsi="Arial"/>
+                <w:color w:val="5A6B66"/>
+                <w:sz w:val="22"/>
+                <w:szCs w:val="22"/>
+              </w:rPr>
+              <w:t xml:space="preserve"/>
+            </w:r>
+          </w:p>
+        </w:tc>
+      </w:tr>
+      <w:tr>
+        <w:tc>
+          <w:tcPr>
+            <w:tcMar>
+              <w:top w:type="dxa" w:w="80"/>
+              <w:left w:type="dxa" w:w="120"/>
+              <w:bottom w:type="dxa" w:w="80"/>
+              <w:right w:type="dxa" w:w="120"/>
+            </w:tcMar>
+            <w:vAlign w:val="center"/>
+          </w:tcPr>
+          <w:p>
+            <w:pPr>
+              <w:spacing w:after="40" w:before="40"/>
+            </w:pPr>
+            <w:r>
+              <w:rPr>
+                <w:rFonts w:ascii="Arial" w:cs="Arial" w:eastAsia="Arial" w:hAnsi="Arial"/>
+                <w:color w:val="5A6B66"/>
+                <w:sz w:val="22"/>
+                <w:szCs w:val="22"/>
+              </w:rPr>
+              <w:t xml:space="preserve">Razão social (se PJ)</w:t>
+            </w:r>
+          </w:p>
+        </w:tc>
+        <w:tc>
+          <w:tcPr>
+            <w:tcMar>
+              <w:top w:type="dxa" w:w="80"/>
+              <w:left w:type="dxa" w:w="120"/>
+              <w:bottom w:type="dxa" w:w="80"/>
+              <w:right w:type="dxa" w:w="120"/>
+            </w:tcMar>
+            <w:vAlign w:val="center"/>
+          </w:tcPr>
+          <w:p>
+            <w:pPr>
+              <w:spacing w:after="40" w:before="40"/>
+            </w:pPr>
+            <w:r>
+              <w:rPr>
+                <w:rFonts w:ascii="Arial" w:cs="Arial" w:eastAsia="Arial" w:hAnsi="Arial"/>
+                <w:color w:val="5A6B66"/>
+                <w:sz w:val="22"/>
+                <w:szCs w:val="22"/>
+              </w:rPr>
+              <w:t xml:space="preserve"/>
+            </w:r>
+          </w:p>
+        </w:tc>
+      </w:tr>
+      <w:tr>
+        <w:tc>
+          <w:tcPr>
+            <w:tcMar>
+              <w:top w:type="dxa" w:w="80"/>
+              <w:left w:type="dxa" w:w="120"/>
+              <w:bottom w:type="dxa" w:w="80"/>
+              <w:right w:type="dxa" w:w="120"/>
+            </w:tcMar>
+            <w:vAlign w:val="center"/>
+          </w:tcPr>
+          <w:p>
+            <w:pPr>
+              <w:spacing w:after="40" w:before="40"/>
+            </w:pPr>
+            <w:r>
+              <w:rPr>
+                <w:rFonts w:ascii="Arial" w:cs="Arial" w:eastAsia="Arial" w:hAnsi="Arial"/>
+                <w:color w:val="5A6B66"/>
+                <w:sz w:val="22"/>
+                <w:szCs w:val="22"/>
+              </w:rPr>
+              <w:t xml:space="preserve">CNPJ ou CPF</w:t>
+            </w:r>
+          </w:p>
+        </w:tc>
+        <w:tc>
+          <w:tcPr>
+            <w:tcMar>
+              <w:top w:type="dxa" w:w="80"/>
+              <w:left w:type="dxa" w:w="120"/>
+              <w:bottom w:type="dxa" w:w="80"/>
+              <w:right w:type="dxa" w:w="120"/>
+            </w:tcMar>
+            <w:vAlign w:val="center"/>
+          </w:tcPr>
+          <w:p>
+            <w:pPr>
+              <w:spacing w:after="40" w:before="40"/>
+            </w:pPr>
+            <w:r>
+              <w:rPr>
+                <w:rFonts w:ascii="Arial" w:cs="Arial" w:eastAsia="Arial" w:hAnsi="Arial"/>
+                <w:color w:val="5A6B66"/>
+                <w:sz w:val="22"/>
+                <w:szCs w:val="22"/>
+              </w:rPr>
+              <w:t xml:space="preserve"/>
+            </w:r>
+          </w:p>
+        </w:tc>
+      </w:tr>
+      <w:tr>
+        <w:tc>
+          <w:tcPr>
+            <w:tcMar>
+              <w:top w:type="dxa" w:w="80"/>
+              <w:left w:type="dxa" w:w="120"/>
+              <w:bottom w:type="dxa" w:w="80"/>
+              <w:right w:type="dxa" w:w="120"/>
+            </w:tcMar>
+            <w:vAlign w:val="center"/>
+          </w:tcPr>
+          <w:p>
+            <w:pPr>
+              <w:spacing w:after="40" w:before="40"/>
+            </w:pPr>
+            <w:r>
+              <w:rPr>
+                <w:rFonts w:ascii="Arial" w:cs="Arial" w:eastAsia="Arial" w:hAnsi="Arial"/>
+                <w:color w:val="5A6B66"/>
+                <w:sz w:val="22"/>
+                <w:szCs w:val="22"/>
+              </w:rPr>
+              <w:t xml:space="preserve">Categoria (ex.: Gastronomia, Hospedagem)</w:t>
+            </w:r>
+          </w:p>
+        </w:tc>
+        <w:tc>
+          <w:tcPr>
+            <w:tcMar>
+              <w:top w:type="dxa" w:w="80"/>
+              <w:left w:type="dxa" w:w="120"/>
+              <w:bottom w:type="dxa" w:w="80"/>
+              <w:right w:type="dxa" w:w="120"/>
+            </w:tcMar>
+            <w:vAlign w:val="center"/>
+          </w:tcPr>
+          <w:p>
+            <w:pPr>
+              <w:spacing w:after="40" w:before="40"/>
+            </w:pPr>
+            <w:r>
+              <w:rPr>
+                <w:rFonts w:ascii="Arial" w:cs="Arial" w:eastAsia="Arial" w:hAnsi="Arial"/>
+                <w:color w:val="5A6B66"/>
+                <w:sz w:val="22"/>
+                <w:szCs w:val="22"/>
+              </w:rPr>
+              <w:t xml:space="preserve"/>
+            </w:r>
+          </w:p>
+        </w:tc>
+      </w:tr>
+      <w:tr>
+        <w:tc>
+          <w:tcPr>
+            <w:tcMar>
+              <w:top w:type="dxa" w:w="80"/>
+              <w:left w:type="dxa" w:w="120"/>
+              <w:bottom w:type="dxa" w:w="80"/>
+              <w:right w:type="dxa" w:w="120"/>
+            </w:tcMar>
+            <w:vAlign w:val="center"/>
+          </w:tcPr>
+          <w:p>
+            <w:pPr>
+              <w:spacing w:after="40" w:before="40"/>
+            </w:pPr>
+            <w:r>
+              <w:rPr>
+                <w:rFonts w:ascii="Arial" w:cs="Arial" w:eastAsia="Arial" w:hAnsi="Arial"/>
+                <w:color w:val="5A6B66"/>
+                <w:sz w:val="22"/>
+                <w:szCs w:val="22"/>
+              </w:rPr>
+              <w:t xml:space="preserve">Subcategoria (ex.: Restaurante, Pousada)</w:t>
+            </w:r>
+          </w:p>
+        </w:tc>
+        <w:tc>
+          <w:tcPr>
+            <w:tcMar>
+              <w:top w:type="dxa" w:w="80"/>
+              <w:left w:type="dxa" w:w="120"/>
+              <w:bottom w:type="dxa" w:w="80"/>
+              <w:right w:type="dxa" w:w="120"/>
+            </w:tcMar>
+            <w:vAlign w:val="center"/>
+          </w:tcPr>
+          <w:p>
+            <w:pPr>
+              <w:spacing w:after="40" w:before="40"/>
+            </w:pPr>
+            <w:r>
+              <w:rPr>
+                <w:rFonts w:ascii="Arial" w:cs="Arial" w:eastAsia="Arial" w:hAnsi="Arial"/>
+                <w:color w:val="5A6B66"/>
+                <w:sz w:val="22"/>
+                <w:szCs w:val="22"/>
+              </w:rPr>
+              <w:t xml:space="preserve"/>
+            </w:r>
+          </w:p>
+        </w:tc>
+      </w:tr>
+      <w:tr>
+        <w:tc>
+          <w:tcPr>
+            <w:tcMar>
+              <w:top w:type="dxa" w:w="80"/>
+              <w:left w:type="dxa" w:w="120"/>
+              <w:bottom w:type="dxa" w:w="80"/>
+              <w:right w:type="dxa" w:w="120"/>
+            </w:tcMar>
+            <w:vAlign w:val="center"/>
+          </w:tcPr>
+          <w:p>
+            <w:pPr>
+              <w:spacing w:after="40" w:before="40"/>
+            </w:pPr>
+            <w:r>
+              <w:rPr>
+                <w:rFonts w:ascii="Arial" w:cs="Arial" w:eastAsia="Arial" w:hAnsi="Arial"/>
+                <w:color w:val="5A6B66"/>
+                <w:sz w:val="22"/>
+                <w:szCs w:val="22"/>
+              </w:rPr>
+              <w:t xml:space="preserve">Endereço completo</w:t>
+            </w:r>
+          </w:p>
+        </w:tc>
+        <w:tc>
+          <w:tcPr>
+            <w:tcMar>
+              <w:top w:type="dxa" w:w="80"/>
+              <w:left w:type="dxa" w:w="120"/>
+              <w:bottom w:type="dxa" w:w="80"/>
+              <w:right w:type="dxa" w:w="120"/>
+            </w:tcMar>
+            <w:vAlign w:val="center"/>
+          </w:tcPr>
+          <w:p>
+            <w:pPr>
+              <w:spacing w:after="40" w:before="40"/>
+            </w:pPr>
+            <w:r>
+              <w:rPr>
+                <w:rFonts w:ascii="Arial" w:cs="Arial" w:eastAsia="Arial" w:hAnsi="Arial"/>
+                <w:color w:val="5A6B66"/>
+                <w:sz w:val="22"/>
+                <w:szCs w:val="22"/>
+              </w:rPr>
+              <w:t xml:space="preserve"/>
+            </w:r>
+          </w:p>
+        </w:tc>
+      </w:tr>
+      <w:tr>
+        <w:tc>
+          <w:tcPr>
+            <w:tcMar>
+              <w:top w:type="dxa" w:w="80"/>
+              <w:left w:type="dxa" w:w="120"/>
+              <w:bottom w:type="dxa" w:w="80"/>
+              <w:right w:type="dxa" w:w="120"/>
+            </w:tcMar>
+            <w:vAlign w:val="center"/>
+          </w:tcPr>
+          <w:p>
+            <w:pPr>
+              <w:spacing w:after="40" w:before="40"/>
+            </w:pPr>
+            <w:r>
+              <w:rPr>
+                <w:rFonts w:ascii="Arial" w:cs="Arial" w:eastAsia="Arial" w:hAnsi="Arial"/>
+                <w:color w:val="5A6B66"/>
+                <w:sz w:val="22"/>
+                <w:szCs w:val="22"/>
+              </w:rPr>
+              <w:t xml:space="preserve">CEP</w:t>
+            </w:r>
+          </w:p>
+        </w:tc>
+        <w:tc>
+          <w:tcPr>
+            <w:tcMar>
+              <w:top w:type="dxa" w:w="80"/>
+              <w:left w:type="dxa" w:w="120"/>
+              <w:bottom w:type="dxa" w:w="80"/>
+              <w:right w:type="dxa" w:w="120"/>
+            </w:tcMar>
+            <w:vAlign w:val="center"/>
+          </w:tcPr>
+          <w:p>
+            <w:pPr>
+              <w:spacing w:after="40" w:before="40"/>
+            </w:pPr>
+            <w:r>
+              <w:rPr>
+                <w:rFonts w:ascii="Arial" w:cs="Arial" w:eastAsia="Arial" w:hAnsi="Arial"/>
+                <w:color w:val="5A6B66"/>
+                <w:sz w:val="22"/>
+                <w:szCs w:val="22"/>
+              </w:rPr>
+              <w:t xml:space="preserve"/>
+            </w:r>
+          </w:p>
+        </w:tc>
+      </w:tr>
+      <w:tr>
+        <w:tc>
+          <w:tcPr>
+            <w:tcMar>
+              <w:top w:type="dxa" w:w="80"/>
+              <w:left w:type="dxa" w:w="120"/>
+              <w:bottom w:type="dxa" w:w="80"/>
+              <w:right w:type="dxa" w:w="120"/>
+            </w:tcMar>
+            <w:vAlign w:val="center"/>
+          </w:tcPr>
+          <w:p>
+            <w:pPr>
+              <w:spacing w:after="40" w:before="40"/>
+            </w:pPr>
+            <w:r>
+              <w:rPr>
+                <w:rFonts w:ascii="Arial" w:cs="Arial" w:eastAsia="Arial" w:hAnsi="Arial"/>
+                <w:color w:val="5A6B66"/>
+                <w:sz w:val="22"/>
+                <w:szCs w:val="22"/>
+              </w:rPr>
+              <w:t xml:space="preserve">Cidade / UF</w:t>
+            </w:r>
+          </w:p>
+        </w:tc>
+        <w:tc>
+          <w:tcPr>
+            <w:tcMar>
+              <w:top w:type="dxa" w:w="80"/>
+              <w:left w:type="dxa" w:w="120"/>
+              <w:bottom w:type="dxa" w:w="80"/>
+              <w:right w:type="dxa" w:w="120"/>
+            </w:tcMar>
+            <w:vAlign w:val="center"/>
+          </w:tcPr>
+          <w:p>
+            <w:pPr>
+              <w:spacing w:after="40" w:before="40"/>
+            </w:pPr>
+            <w:r>
+              <w:rPr>
+                <w:rFonts w:ascii="Arial" w:cs="Arial" w:eastAsia="Arial" w:hAnsi="Arial"/>
+                <w:color w:val="5A6B66"/>
+                <w:sz w:val="22"/>
+                <w:szCs w:val="22"/>
+              </w:rPr>
+              <w:t xml:space="preserve"/>
+            </w:r>
+          </w:p>
+        </w:tc>
+      </w:tr>
+      <w:tr>
+        <w:tc>
+          <w:tcPr>
+            <w:tcMar>
+              <w:top w:type="dxa" w:w="80"/>
+              <w:left w:type="dxa" w:w="120"/>
+              <w:bottom w:type="dxa" w:w="80"/>
+              <w:right w:type="dxa" w:w="120"/>
+            </w:tcMar>
+            <w:vAlign w:val="center"/>
+          </w:tcPr>
+          <w:p>
+            <w:pPr>
+              <w:spacing w:after="40" w:before="40"/>
+            </w:pPr>
+            <w:r>
+              <w:rPr>
+                <w:rFonts w:ascii="Arial" w:cs="Arial" w:eastAsia="Arial" w:hAnsi="Arial"/>
+                <w:color w:val="5A6B66"/>
+                <w:sz w:val="22"/>
+                <w:szCs w:val="22"/>
+              </w:rPr>
+              <w:t xml:space="preserve">Telefone / WhatsApp</w:t>
+            </w:r>
+          </w:p>
+        </w:tc>
+        <w:tc>
+          <w:tcPr>
+            <w:tcMar>
+              <w:top w:type="dxa" w:w="80"/>
+              <w:left w:type="dxa" w:w="120"/>
+              <w:bottom w:type="dxa" w:w="80"/>
+              <w:right w:type="dxa" w:w="120"/>
+            </w:tcMar>
+            <w:vAlign w:val="center"/>
+          </w:tcPr>
+          <w:p>
+            <w:pPr>
+              <w:spacing w:after="40" w:before="40"/>
+            </w:pPr>
+            <w:r>
+              <w:rPr>
+                <w:rFonts w:ascii="Arial" w:cs="Arial" w:eastAsia="Arial" w:hAnsi="Arial"/>
+                <w:color w:val="5A6B66"/>
+                <w:sz w:val="22"/>
+                <w:szCs w:val="22"/>
+              </w:rPr>
+              <w:t xml:space="preserve"/>
+            </w:r>
+          </w:p>
+        </w:tc>
+      </w:tr>
+      <w:tr>
+        <w:tc>
+          <w:tcPr>
+            <w:tcMar>
+              <w:top w:type="dxa" w:w="80"/>
+              <w:left w:type="dxa" w:w="120"/>
+              <w:bottom w:type="dxa" w:w="80"/>
+              <w:right w:type="dxa" w:w="120"/>
+            </w:tcMar>
+            <w:vAlign w:val="center"/>
+          </w:tcPr>
+          <w:p>
+            <w:pPr>
+              <w:spacing w:after="40" w:before="40"/>
+            </w:pPr>
+            <w:r>
+              <w:rPr>
+                <w:rFonts w:ascii="Arial" w:cs="Arial" w:eastAsia="Arial" w:hAnsi="Arial"/>
+                <w:color w:val="5A6B66"/>
+                <w:sz w:val="22"/>
+                <w:szCs w:val="22"/>
+              </w:rPr>
+              <w:t xml:space="preserve">E-mail para cobrança e contato</w:t>
+            </w:r>
+          </w:p>
+        </w:tc>
+        <w:tc>
+          <w:tcPr>
+            <w:tcMar>
+              <w:top w:type="dxa" w:w="80"/>
+              <w:left w:type="dxa" w:w="120"/>
+              <w:bottom w:type="dxa" w:w="80"/>
+              <w:right w:type="dxa" w:w="120"/>
+            </w:tcMar>
+            <w:vAlign w:val="center"/>
+          </w:tcPr>
+          <w:p>
+            <w:pPr>
+              <w:spacing w:after="40" w:before="40"/>
+            </w:pPr>
+            <w:r>
+              <w:rPr>
+                <w:rFonts w:ascii="Arial" w:cs="Arial" w:eastAsia="Arial" w:hAnsi="Arial"/>
+                <w:color w:val="5A6B66"/>
+                <w:sz w:val="22"/>
+                <w:szCs w:val="22"/>
+              </w:rPr>
+              <w:t xml:space="preserve"/>
+            </w:r>
+          </w:p>
+        </w:tc>
+      </w:tr>
+      <w:tr>
+        <w:tc>
+          <w:tcPr>
+            <w:tcMar>
+              <w:top w:type="dxa" w:w="80"/>
+              <w:left w:type="dxa" w:w="120"/>
+              <w:bottom w:type="dxa" w:w="80"/>
+              <w:right w:type="dxa" w:w="120"/>
+            </w:tcMar>
+            <w:vAlign w:val="center"/>
+          </w:tcPr>
+          <w:p>
+            <w:pPr>
+              <w:spacing w:after="40" w:before="40"/>
+            </w:pPr>
+            <w:r>
+              <w:rPr>
+                <w:rFonts w:ascii="Arial" w:cs="Arial" w:eastAsia="Arial" w:hAnsi="Arial"/>
+                <w:color w:val="5A6B66"/>
+                <w:sz w:val="22"/>
+                <w:szCs w:val="22"/>
+              </w:rPr>
+              <w:t xml:space="preserve">Nome do responsável legal</w:t>
+            </w:r>
+          </w:p>
+        </w:tc>
+        <w:tc>
+          <w:tcPr>
+            <w:tcMar>
+              <w:top w:type="dxa" w:w="80"/>
+              <w:left w:type="dxa" w:w="120"/>
+              <w:bottom w:type="dxa" w:w="80"/>
+              <w:right w:type="dxa" w:w="120"/>
+            </w:tcMar>
+            <w:vAlign w:val="center"/>
+          </w:tcPr>
+          <w:p>
+            <w:pPr>
+              <w:spacing w:after="40" w:before="40"/>
+            </w:pPr>
+            <w:r>
+              <w:rPr>
+                <w:rFonts w:ascii="Arial" w:cs="Arial" w:eastAsia="Arial" w:hAnsi="Arial"/>
+                <w:color w:val="5A6B66"/>
+                <w:sz w:val="22"/>
+                <w:szCs w:val="22"/>
+              </w:rPr>
+              <w:t xml:space="preserve"/>
+            </w:r>
+          </w:p>
+        </w:tc>
+      </w:tr>
+      <w:tr>
+        <w:tc>
+          <w:tcPr>
+            <w:tcMar>
+              <w:top w:type="dxa" w:w="80"/>
+              <w:left w:type="dxa" w:w="120"/>
+              <w:bottom w:type="dxa" w:w="80"/>
+              <w:right w:type="dxa" w:w="120"/>
+            </w:tcMar>
+            <w:vAlign w:val="center"/>
+          </w:tcPr>
+          <w:p>
+            <w:pPr>
+              <w:spacing w:after="40" w:before="40"/>
+            </w:pPr>
+            <w:r>
+              <w:rPr>
+                <w:rFonts w:ascii="Arial" w:cs="Arial" w:eastAsia="Arial" w:hAnsi="Arial"/>
+                <w:color w:val="5A6B66"/>
+                <w:sz w:val="22"/>
+                <w:szCs w:val="22"/>
+              </w:rPr>
+              <w:t xml:space="preserve">CPF do responsável</w:t>
+            </w:r>
+          </w:p>
+        </w:tc>
+        <w:tc>
+          <w:tcPr>
+            <w:tcMar>
+              <w:top w:type="dxa" w:w="80"/>
+              <w:left w:type="dxa" w:w="120"/>
+              <w:bottom w:type="dxa" w:w="80"/>
+              <w:right w:type="dxa" w:w="120"/>
+            </w:tcMar>
+            <w:vAlign w:val="center"/>
+          </w:tcPr>
+          <w:p>
+            <w:pPr>
+              <w:spacing w:after="40" w:before="40"/>
+            </w:pPr>
+            <w:r>
+              <w:rPr>
+                <w:rFonts w:ascii="Arial" w:cs="Arial" w:eastAsia="Arial" w:hAnsi="Arial"/>
+                <w:color w:val="5A6B66"/>
+                <w:sz w:val="22"/>
+                <w:szCs w:val="22"/>
+              </w:rPr>
+              <w:t xml:space="preserve"/>
+            </w:r>
+          </w:p>
+        </w:tc>
+      </w:tr>
+      <w:tr>
+        <w:tc>
+          <w:tcPr>
+            <w:tcMar>
+              <w:top w:type="dxa" w:w="80"/>
+              <w:left w:type="dxa" w:w="120"/>
+              <w:bottom w:type="dxa" w:w="80"/>
+              <w:right w:type="dxa" w:w="120"/>
+            </w:tcMar>
+            <w:vAlign w:val="center"/>
+          </w:tcPr>
+          <w:p>
+            <w:pPr>
+              <w:spacing w:after="40" w:before="40"/>
+            </w:pPr>
+            <w:r>
+              <w:rPr>
+                <w:rFonts w:ascii="Arial" w:cs="Arial" w:eastAsia="Arial" w:hAnsi="Arial"/>
+                <w:color w:val="5A6B66"/>
+                <w:sz w:val="22"/>
+                <w:szCs w:val="22"/>
+              </w:rPr>
+              <w:t xml:space="preserve">Instagram</w:t>
+            </w:r>
+          </w:p>
+        </w:tc>
+        <w:tc>
+          <w:tcPr>
+            <w:tcMar>
+              <w:top w:type="dxa" w:w="80"/>
+              <w:left w:type="dxa" w:w="120"/>
+              <w:bottom w:type="dxa" w:w="80"/>
+              <w:right w:type="dxa" w:w="120"/>
+            </w:tcMar>
+            <w:vAlign w:val="center"/>
+          </w:tcPr>
+          <w:p>
+            <w:pPr>
+              <w:spacing w:after="40" w:before="40"/>
+            </w:pPr>
+            <w:r>
+              <w:rPr>
+                <w:rFonts w:ascii="Arial" w:cs="Arial" w:eastAsia="Arial" w:hAnsi="Arial"/>
+                <w:color w:val="5A6B66"/>
+                <w:sz w:val="22"/>
+                <w:szCs w:val="22"/>
+              </w:rPr>
+              <w:t xml:space="preserve"/>
+            </w:r>
+          </w:p>
+        </w:tc>
+      </w:tr>
+      <w:tr>
+        <w:tc>
+          <w:tcPr>
+            <w:tcMar>
+              <w:top w:type="dxa" w:w="80"/>
+              <w:left w:type="dxa" w:w="120"/>
+              <w:bottom w:type="dxa" w:w="80"/>
+              <w:right w:type="dxa" w:w="120"/>
+            </w:tcMar>
+            <w:vAlign w:val="center"/>
+          </w:tcPr>
+          <w:p>
+            <w:pPr>
+              <w:spacing w:after="40" w:before="40"/>
+            </w:pPr>
+            <w:r>
+              <w:rPr>
+                <w:rFonts w:ascii="Arial" w:cs="Arial" w:eastAsia="Arial" w:hAnsi="Arial"/>
+                <w:color w:val="5A6B66"/>
+                <w:sz w:val="22"/>
+                <w:szCs w:val="22"/>
+              </w:rPr>
+              <w:t xml:space="preserve">Site</w:t>
+            </w:r>
+          </w:p>
+        </w:tc>
+        <w:tc>
+          <w:tcPr>
+            <w:tcMar>
+              <w:top w:type="dxa" w:w="80"/>
+              <w:left w:type="dxa" w:w="120"/>
+              <w:bottom w:type="dxa" w:w="80"/>
+              <w:right w:type="dxa" w:w="120"/>
+            </w:tcMar>
+            <w:vAlign w:val="center"/>
+          </w:tcPr>
+          <w:p>
+            <w:pPr>
+              <w:spacing w:after="40" w:before="40"/>
+            </w:pPr>
+            <w:r>
+              <w:rPr>
+                <w:rFonts w:ascii="Arial" w:cs="Arial" w:eastAsia="Arial" w:hAnsi="Arial"/>
+                <w:color w:val="5A6B66"/>
+                <w:sz w:val="22"/>
+                <w:szCs w:val="22"/>
+              </w:rPr>
+              <w:t xml:space="preserve"/>
+            </w:r>
+          </w:p>
+        </w:tc>
+      </w:tr>
+      <w:tr>
+        <w:tc>
+          <w:tcPr>
+            <w:tcMar>
+              <w:top w:type="dxa" w:w="80"/>
+              <w:left w:type="dxa" w:w="120"/>
+              <w:bottom w:type="dxa" w:w="80"/>
+              <w:right w:type="dxa" w:w="120"/>
+            </w:tcMar>
+            <w:vAlign w:val="center"/>
+          </w:tcPr>
+          <w:p>
+            <w:pPr>
+              <w:spacing w:after="40" w:before="40"/>
+            </w:pPr>
+            <w:r>
+              <w:rPr>
+                <w:rFonts w:ascii="Arial" w:cs="Arial" w:eastAsia="Arial" w:hAnsi="Arial"/>
+                <w:color w:val="5A6B66"/>
+                <w:sz w:val="22"/>
+                <w:szCs w:val="22"/>
+              </w:rPr>
+              <w:t xml:space="preserve">Link do cardápio (se houver)</w:t>
+            </w:r>
+          </w:p>
+        </w:tc>
+        <w:tc>
+          <w:tcPr>
+            <w:tcMar>
+              <w:top w:type="dxa" w:w="80"/>
+              <w:left w:type="dxa" w:w="120"/>
+              <w:bottom w:type="dxa" w:w="80"/>
+              <w:right w:type="dxa" w:w="120"/>
+            </w:tcMar>
+            <w:vAlign w:val="center"/>
+          </w:tcPr>
+          <w:p>
+            <w:pPr>
+              <w:spacing w:after="40" w:before="40"/>
+            </w:pPr>
+            <w:r>
+              <w:rPr>
+                <w:rFonts w:ascii="Arial" w:cs="Arial" w:eastAsia="Arial" w:hAnsi="Arial"/>
+                <w:color w:val="5A6B66"/>
+                <w:sz w:val="22"/>
+                <w:szCs w:val="22"/>
+              </w:rPr>
+              <w:t xml:space="preserve"/>
+            </w:r>
+          </w:p>
+        </w:tc>
+      </w:tr>
+      <w:tr>
+        <w:tc>
+          <w:tcPr>
+            <w:tcMar>
+              <w:top w:type="dxa" w:w="80"/>
+              <w:left w:type="dxa" w:w="120"/>
+              <w:bottom w:type="dxa" w:w="80"/>
+              <w:right w:type="dxa" w:w="120"/>
+            </w:tcMar>
+            <w:vAlign w:val="center"/>
+          </w:tcPr>
+          <w:p>
+            <w:pPr>
+              <w:spacing w:after="40" w:before="40"/>
+            </w:pPr>
+            <w:r>
+              <w:rPr>
+                <w:rFonts w:ascii="Arial" w:cs="Arial" w:eastAsia="Arial" w:hAnsi="Arial"/>
+                <w:color w:val="5A6B66"/>
+                <w:sz w:val="22"/>
+                <w:szCs w:val="22"/>
+              </w:rPr>
+              <w:t xml:space="preserve">Horário de funcionamento</w:t>
+            </w:r>
+          </w:p>
+        </w:tc>
+        <w:tc>
+          <w:tcPr>
+            <w:tcMar>
+              <w:top w:type="dxa" w:w="80"/>
+              <w:left w:type="dxa" w:w="120"/>
+              <w:bottom w:type="dxa" w:w="80"/>
+              <w:right w:type="dxa" w:w="120"/>
+            </w:tcMar>
+            <w:vAlign w:val="center"/>
+          </w:tcPr>
+          <w:p>
+            <w:pPr>
+              <w:spacing w:after="40" w:before="40"/>
+            </w:pPr>
+            <w:r>
+              <w:rPr>
+                <w:rFonts w:ascii="Arial" w:cs="Arial" w:eastAsia="Arial" w:hAnsi="Arial"/>
+                <w:color w:val="5A6B66"/>
+                <w:sz w:val="22"/>
+                <w:szCs w:val="22"/>
+              </w:rPr>
+              <w:t xml:space="preserve"/>
+            </w:r>
+          </w:p>
+        </w:tc>
+      </w:tr>
+      <w:tr>
+        <w:tc>
+          <w:tcPr>
+            <w:tcMar>
+              <w:top w:type="dxa" w:w="80"/>
+              <w:left w:type="dxa" w:w="120"/>
+              <w:bottom w:type="dxa" w:w="80"/>
+              <w:right w:type="dxa" w:w="120"/>
+            </w:tcMar>
+            <w:vAlign w:val="center"/>
+          </w:tcPr>
+          <w:p>
+            <w:pPr>
+              <w:spacing w:after="40" w:before="40"/>
+            </w:pPr>
+            <w:r>
+              <w:rPr>
+                <w:rFonts w:ascii="Arial" w:cs="Arial" w:eastAsia="Arial" w:hAnsi="Arial"/>
+                <w:color w:val="5A6B66"/>
+                <w:sz w:val="22"/>
+                <w:szCs w:val="22"/>
+              </w:rPr>
+              <w:t xml:space="preserve">Breve descrição do estabelecimento</w:t>
+            </w:r>
+          </w:p>
+        </w:tc>
+        <w:tc>
+          <w:tcPr>
+            <w:tcMar>
+              <w:top w:type="dxa" w:w="80"/>
+              <w:left w:type="dxa" w:w="120"/>
+              <w:bottom w:type="dxa" w:w="80"/>
+              <w:right w:type="dxa" w:w="120"/>
+            </w:tcMar>
+            <w:vAlign w:val="center"/>
+          </w:tcPr>
+          <w:p>
+            <w:pPr>
+              <w:spacing w:after="40" w:before="40"/>
+            </w:pPr>
+            <w:r>
+              <w:rPr>
+                <w:rFonts w:ascii="Arial" w:cs="Arial" w:eastAsia="Arial" w:hAnsi="Arial"/>
+                <w:color w:val="5A6B66"/>
+                <w:sz w:val="22"/>
+                <w:szCs w:val="22"/>
+              </w:rPr>
+              <w:t xml:space="preserve"/>
+            </w:r>
+          </w:p>
+        </w:tc>
+      </w:tr>
+    </w:tbl>
+    <w:p>
+      <w:pPr>
+        <w:spacing w:after="120" w:before="0"/>
+      </w:pPr>
+    </w:p>
+    <w:p>
+      <w:pPr>
+        <w:spacing w:after="140" w:before="0"/>
+      </w:pPr>
+      <w:r>
+        <w:rPr>
+          <w:rFonts w:ascii="Arial" w:cs="Arial" w:eastAsia="Arial" w:hAnsi="Arial"/>
+          <w:b/>
+          <w:bCs/>
+          <w:color w:val="1A2E28"/>
+          <w:sz w:val="22"/>
+          <w:szCs w:val="22"/>
+        </w:rPr>
+        <w:t xml:space="preserve">Checklist de materiais a enviar:</w:t>
+      </w:r>
+    </w:p>
+    <w:p>
+      <w:pPr>
+        <w:spacing w:after="80" w:before="0"/>
+      </w:pPr>
+      <w:r>
+        <w:rPr>
+          <w:rFonts w:ascii="Arial" w:cs="Arial" w:eastAsia="Arial" w:hAnsi="Arial"/>
+          <w:b/>
+          <w:bCs/>
+          <w:color w:val="1A4A3A"/>
+          <w:sz w:val="22"/>
+          <w:szCs w:val="22"/>
+        </w:rPr>
+        <w:t xml:space="preserve">• </w:t>
+      </w:r>
+      <w:r>
+        <w:rPr>
+          <w:rFonts w:ascii="Arial" w:cs="Arial" w:eastAsia="Arial" w:hAnsi="Arial"/>
+          <w:color w:val="5A6B66"/>
+          <w:sz w:val="22"/>
+          <w:szCs w:val="22"/>
+        </w:rPr>
+        <w:t xml:space="preserve">Mínimo de 3 fotos do estabelecimento (ambiente, fachada ou produtos)</w:t>
+      </w:r>
+    </w:p>
+    <w:p>
+      <w:pPr>
+        <w:spacing w:after="80" w:before="0"/>
+      </w:pPr>
+      <w:r>
+        <w:rPr>
+          <w:rFonts w:ascii="Arial" w:cs="Arial" w:eastAsia="Arial" w:hAnsi="Arial"/>
+          <w:b/>
+          <w:bCs/>
+          <w:color w:val="1A4A3A"/>
+          <w:sz w:val="22"/>
+          <w:szCs w:val="22"/>
+        </w:rPr>
+        <w:t xml:space="preserve">• </w:t>
+      </w:r>
+      <w:r>
+        <w:rPr>
+          <w:rFonts w:ascii="Arial" w:cs="Arial" w:eastAsia="Arial" w:hAnsi="Arial"/>
+          <w:color w:val="5A6B66"/>
+          <w:sz w:val="22"/>
+          <w:szCs w:val="22"/>
+        </w:rPr>
+        <w:t xml:space="preserve">Logotipo (se houver), em arquivo de boa qualidade</w:t>
+      </w:r>
+    </w:p>
+    <w:p>
+      <w:pPr>
+        <w:spacing w:after="80" w:before="0"/>
+      </w:pPr>
+      <w:r>
+        <w:rPr>
+          <w:rFonts w:ascii="Arial" w:cs="Arial" w:eastAsia="Arial" w:hAnsi="Arial"/>
+          <w:b/>
+          <w:bCs/>
+          <w:color w:val="1A4A3A"/>
+          <w:sz w:val="22"/>
+          <w:szCs w:val="22"/>
+        </w:rPr>
+        <w:t xml:space="preserve">• </w:t>
+      </w:r>
+      <w:r>
+        <w:rPr>
+          <w:rFonts w:ascii="Arial" w:cs="Arial" w:eastAsia="Arial" w:hAnsi="Arial"/>
+          <w:color w:val="5A6B66"/>
+          <w:sz w:val="22"/>
+          <w:szCs w:val="22"/>
+        </w:rPr>
+        <w:t xml:space="preserve">Horários de funcionamento atualizados</w:t>
+      </w:r>
+    </w:p>
+    <w:p>
+      <w:pPr>
+        <w:spacing w:after="80" w:before="0"/>
+      </w:pPr>
+      <w:r>
+        <w:rPr>
+          <w:rFonts w:ascii="Arial" w:cs="Arial" w:eastAsia="Arial" w:hAnsi="Arial"/>
+          <w:b/>
+          <w:bCs/>
+          <w:color w:val="1A4A3A"/>
+          <w:sz w:val="22"/>
+          <w:szCs w:val="22"/>
+        </w:rPr>
+        <w:t xml:space="preserve">• </w:t>
+      </w:r>
+      <w:r>
+        <w:rPr>
+          <w:rFonts w:ascii="Arial" w:cs="Arial" w:eastAsia="Arial" w:hAnsi="Arial"/>
+          <w:color w:val="5A6B66"/>
+          <w:sz w:val="22"/>
+          <w:szCs w:val="22"/>
+        </w:rPr>
+        <w:t xml:space="preserve">Confirmação de endereço e ponto no mapa</w:t>
+      </w:r>
+    </w:p>
+    <w:p>
+      <w:pPr>
+        <w:pBdr>
+          <w:bottom w:val="single" w:color="1A4A3A" w:sz="6"/>
+        </w:pBdr>
+        <w:spacing w:after="200" w:before="200"/>
+      </w:pPr>
+    </w:p>
+    <w:p>
+      <w:pPr>
+        <w:pBdr>
+          <w:bottom w:val="single" w:color="1A4A3A" w:sz="6"/>
+        </w:pBdr>
+        <w:spacing w:after="200" w:before="200"/>
+      </w:pPr>
+    </w:p>
+    <w:p>
+      <w:r>
+        <w:br w:type="page"/>
+      </w:r>
+    </w:p>
+    <w:p>
+      <w:pPr>
+        <w:pStyle w:val="Heading1"/>
+        <w:spacing w:after="200" w:before="280"/>
+      </w:pPr>
+      <w:r>
+        <w:rPr>
+          <w:rFonts w:ascii="Arial" w:cs="Arial" w:eastAsia="Arial" w:hAnsi="Arial"/>
+          <w:b/>
+          <w:bCs/>
+          <w:color w:val="1A4A3A"/>
+          <w:sz w:val="32"/>
+          <w:szCs w:val="32"/>
+        </w:rPr>
+        <w:t xml:space="preserve">ANEXO III — AUTORIZAÇÃO DE USO DE IMAGEM E CONTEÚDO</w:t>
+      </w:r>
+    </w:p>
+    <w:p>
+      <w:pPr>
+        <w:spacing w:after="140" w:before="0"/>
+      </w:pPr>
+      <w:r>
+        <w:rPr>
+          <w:rFonts w:ascii="Arial" w:cs="Arial" w:eastAsia="Arial" w:hAnsi="Arial"/>
+          <w:color w:val="5A6B66"/>
+          <w:sz w:val="22"/>
+          <w:szCs w:val="22"/>
+        </w:rPr>
+        <w:t xml:space="preserve">Integra o Contrato de Prestação de Serviços celebrado entre a CONTRATADA e a CONTRATANTE.</w:t>
+      </w:r>
+    </w:p>
+    <w:p>
+      <w:pPr>
+        <w:spacing w:after="140" w:before="0"/>
+      </w:pPr>
+      <w:r>
+        <w:rPr>
+          <w:rFonts w:ascii="Arial" w:cs="Arial" w:eastAsia="Arial" w:hAnsi="Arial"/>
+          <w:color w:val="5A6B66"/>
+          <w:sz w:val="22"/>
+          <w:szCs w:val="22"/>
+        </w:rPr>
+        <w:t xml:space="preserve">A </w:t>
+      </w:r>
+      <w:r>
+        <w:rPr>
+          <w:rFonts w:ascii="Arial" w:cs="Arial" w:eastAsia="Arial" w:hAnsi="Arial"/>
+          <w:b/>
+          <w:bCs/>
+          <w:color w:val="1A2E28"/>
+          <w:sz w:val="22"/>
+          <w:szCs w:val="22"/>
+        </w:rPr>
+        <w:t xml:space="preserve">CONTRATANTE</w:t>
+      </w:r>
+      <w:r>
+        <w:rPr>
+          <w:rFonts w:ascii="Arial" w:cs="Arial" w:eastAsia="Arial" w:hAnsi="Arial"/>
+          <w:color w:val="5A6B66"/>
+          <w:sz w:val="22"/>
+          <w:szCs w:val="22"/>
+        </w:rPr>
+        <w:t xml:space="preserve">, na qualidade de titular ou legítima detentora de autorização sobre as imagens, textos, logotipos e demais materiais fornecidos, </w:t>
+      </w:r>
+      <w:r>
+        <w:rPr>
+          <w:rFonts w:ascii="Arial" w:cs="Arial" w:eastAsia="Arial" w:hAnsi="Arial"/>
+          <w:b/>
+          <w:bCs/>
+          <w:color w:val="1A2E28"/>
+          <w:sz w:val="22"/>
+          <w:szCs w:val="22"/>
+        </w:rPr>
+        <w:t xml:space="preserve">autoriza</w:t>
+      </w:r>
+      <w:r>
+        <w:rPr>
+          <w:rFonts w:ascii="Arial" w:cs="Arial" w:eastAsia="Arial" w:hAnsi="Arial"/>
+          <w:color w:val="5A6B66"/>
+          <w:sz w:val="22"/>
+          <w:szCs w:val="22"/>
+        </w:rPr>
+        <w:t xml:space="preserve"> a </w:t>
+      </w:r>
+      <w:r>
+        <w:rPr>
+          <w:rFonts w:ascii="Arial" w:cs="Arial" w:eastAsia="Arial" w:hAnsi="Arial"/>
+          <w:b/>
+          <w:bCs/>
+          <w:color w:val="1A2E28"/>
+          <w:sz w:val="22"/>
+          <w:szCs w:val="22"/>
+        </w:rPr>
+        <w:t xml:space="preserve">CONTRATADA</w:t>
+      </w:r>
+      <w:r>
+        <w:rPr>
+          <w:rFonts w:ascii="Arial" w:cs="Arial" w:eastAsia="Arial" w:hAnsi="Arial"/>
+          <w:color w:val="5A6B66"/>
+          <w:sz w:val="22"/>
+          <w:szCs w:val="22"/>
+        </w:rPr>
+        <w:t xml:space="preserve"> (</w:t>
+      </w:r>
+      <w:r>
+        <w:rPr>
+          <w:rFonts w:ascii="Arial" w:cs="Arial" w:eastAsia="Arial" w:hAnsi="Arial"/>
+          <w:color w:val="5A6B66"/>
+          <w:sz w:val="22"/>
+          <w:szCs w:val="22"/>
+        </w:rPr>
+        <w:t xml:space="preserve">RAZÃO SOCIAL</w:t>
+      </w:r>
+      <w:r>
+        <w:rPr>
+          <w:rFonts w:ascii="Arial" w:cs="Arial" w:eastAsia="Arial" w:hAnsi="Arial"/>
+          <w:color w:val="5A6B66"/>
+          <w:sz w:val="22"/>
+          <w:szCs w:val="22"/>
+        </w:rPr>
+        <w:t xml:space="preserve">, LTDA, CNPJ 40.534.524/0001-87, nome fantasia Guia de Bolso) a utilizar tais conteúdos, de forma </w:t>
+      </w:r>
+      <w:r>
+        <w:rPr>
+          <w:rFonts w:ascii="Arial" w:cs="Arial" w:eastAsia="Arial" w:hAnsi="Arial"/>
+          <w:b/>
+          <w:bCs/>
+          <w:color w:val="1A2E28"/>
+          <w:sz w:val="22"/>
+          <w:szCs w:val="22"/>
+        </w:rPr>
+        <w:t xml:space="preserve">não exclusiva</w:t>
+      </w:r>
+      <w:r>
+        <w:rPr>
+          <w:rFonts w:ascii="Arial" w:cs="Arial" w:eastAsia="Arial" w:hAnsi="Arial"/>
+          <w:color w:val="5A6B66"/>
+          <w:sz w:val="22"/>
+          <w:szCs w:val="22"/>
+        </w:rPr>
+        <w:t xml:space="preserve">, pelo prazo de vigência do Contrato, exclusivamente para:</w:t>
+      </w:r>
+    </w:p>
+    <w:p>
+      <w:pPr>
+        <w:spacing w:after="140" w:before="0"/>
+      </w:pPr>
+      <w:r>
+        <w:rPr>
+          <w:rFonts w:ascii="Arial" w:cs="Arial" w:eastAsia="Arial" w:hAnsi="Arial"/>
+          <w:color w:val="5A6B66"/>
+          <w:sz w:val="22"/>
+          <w:szCs w:val="22"/>
+        </w:rPr>
+        <w:t xml:space="preserve">a) Exibição do perfil do estabelecimento no aplicativo e site Guia de Bolso;</w:t>
+      </w:r>
+    </w:p>
+    <w:p>
+      <w:pPr>
+        <w:spacing w:after="140" w:before="0"/>
+      </w:pPr>
+      <w:r>
+        <w:rPr>
+          <w:rFonts w:ascii="Arial" w:cs="Arial" w:eastAsia="Arial" w:hAnsi="Arial"/>
+          <w:color w:val="5A6B66"/>
+          <w:sz w:val="22"/>
+          <w:szCs w:val="22"/>
+        </w:rPr>
+        <w:t xml:space="preserve">b) Geração de QR Code e materiais PDF vinculados ao estabelecimento;</w:t>
+      </w:r>
+    </w:p>
+    <w:p>
+      <w:pPr>
+        <w:spacing w:after="140" w:before="0"/>
+      </w:pPr>
+      <w:r>
+        <w:rPr>
+          <w:rFonts w:ascii="Arial" w:cs="Arial" w:eastAsia="Arial" w:hAnsi="Arial"/>
+          <w:color w:val="5A6B66"/>
+          <w:sz w:val="22"/>
+          <w:szCs w:val="22"/>
+        </w:rPr>
+        <w:t xml:space="preserve">c) Divulgação do estabelecimento como Parceiro do Guia em canais digitais diretamente relacionados à plataforma.</w:t>
+      </w:r>
+    </w:p>
+    <w:p>
+      <w:pPr>
+        <w:spacing w:after="140" w:before="0"/>
+      </w:pPr>
+      <w:r>
+        <w:rPr>
+          <w:rFonts w:ascii="Arial" w:cs="Arial" w:eastAsia="Arial" w:hAnsi="Arial"/>
+          <w:color w:val="5A6B66"/>
+          <w:sz w:val="22"/>
+          <w:szCs w:val="22"/>
+        </w:rPr>
+        <w:t xml:space="preserve">A CONTRATANTE declara que os materiais fornecidos </w:t>
+      </w:r>
+      <w:r>
+        <w:rPr>
+          <w:rFonts w:ascii="Arial" w:cs="Arial" w:eastAsia="Arial" w:hAnsi="Arial"/>
+          <w:b/>
+          <w:bCs/>
+          <w:color w:val="1A2E28"/>
+          <w:sz w:val="22"/>
+          <w:szCs w:val="22"/>
+        </w:rPr>
+        <w:t xml:space="preserve">não violam direitos de terceiros</w:t>
+      </w:r>
+      <w:r>
+        <w:rPr>
+          <w:rFonts w:ascii="Arial" w:cs="Arial" w:eastAsia="Arial" w:hAnsi="Arial"/>
+          <w:color w:val="5A6B66"/>
+          <w:sz w:val="22"/>
+          <w:szCs w:val="22"/>
+        </w:rPr>
+        <w:t xml:space="preserve"> e compromete-se a indenizar a CONTRATADA por reclamações decorrentes de uso de conteúdo ilegítimo por parte da CONTRATANTE.</w:t>
+      </w:r>
+    </w:p>
+    <w:p>
+      <w:pPr>
+        <w:spacing w:after="140" w:before="0"/>
+      </w:pPr>
+      <w:r>
+        <w:rPr>
+          <w:rFonts w:ascii="Arial" w:cs="Arial" w:eastAsia="Arial" w:hAnsi="Arial"/>
+          <w:color w:val="5A6B66"/>
+          <w:sz w:val="22"/>
+          <w:szCs w:val="22"/>
+        </w:rPr>
+        <w:t xml:space="preserve">Com a rescisão do Contrato e remoção do perfil comercial, cessa a autorização acima, salvo retenção mínima exigida por lei.</w:t>
+      </w:r>
+    </w:p>
+    <w:p>
+      <w:pPr>
+        <w:spacing w:after="140" w:before="0"/>
+      </w:pPr>
+      <w:r>
+        <w:rPr>
+          <w:rFonts w:ascii="Arial" w:cs="Arial" w:eastAsia="Arial" w:hAnsi="Arial"/>
+          <w:color w:val="5A6B66"/>
+          <w:sz w:val="22"/>
+          <w:szCs w:val="22"/>
+        </w:rPr>
+        <w:t xml:space="preserve">Imbituba/SC, </w:t>
+      </w:r>
+      <w:r>
+        <w:rPr>
+          <w:rFonts w:ascii="Arial" w:cs="Arial" w:eastAsia="Arial" w:hAnsi="Arial"/>
+          <w:color w:val="5A6B66"/>
+          <w:sz w:val="22"/>
+          <w:szCs w:val="22"/>
+          <w:u w:val="single"/>
+        </w:rPr>
+        <w:t xml:space="preserve"> de </w:t>
+      </w:r>
+      <w:r>
+        <w:rPr>
+          <w:rFonts w:ascii="Arial" w:cs="Arial" w:eastAsia="Arial" w:hAnsi="Arial"/>
+          <w:color w:val="5A6B66"/>
+          <w:sz w:val="22"/>
+          <w:szCs w:val="22"/>
+          <w:u w:val="single"/>
+        </w:rPr>
+        <w:t xml:space="preserve"> de </w:t>
+      </w:r>
+      <w:r>
+        <w:rPr>
+          <w:rFonts w:ascii="Arial" w:cs="Arial" w:eastAsia="Arial" w:hAnsi="Arial"/>
+          <w:color w:val="5A6B66"/>
+          <w:sz w:val="22"/>
+          <w:szCs w:val="22"/>
+        </w:rPr>
+        <w:t xml:space="preserve">.</w:t>
+      </w:r>
+    </w:p>
+    <w:p>
+      <w:pPr>
+        <w:spacing w:after="140" w:before="0"/>
+      </w:pPr>
+      <w:r>
+        <w:rPr>
+          <w:rFonts w:ascii="Arial" w:cs="Arial" w:eastAsia="Arial" w:hAnsi="Arial"/>
+          <w:b/>
+          <w:bCs/>
+          <w:color w:val="1A2E28"/>
+          <w:sz w:val="22"/>
+          <w:szCs w:val="22"/>
+        </w:rPr>
+        <w:t xml:space="preserve">CONTRATANTE</w:t>
+      </w:r>
+    </w:p>
+    <w:p>
+      <w:pPr>
+        <w:spacing w:after="140" w:before="0"/>
+      </w:pPr>
+      <w:r>
+        <w:rPr>
+          <w:rFonts w:ascii="Arial" w:cs="Arial" w:eastAsia="Arial" w:hAnsi="Arial"/>
+          <w:color w:val="5A6B66"/>
+          <w:sz w:val="22"/>
+          <w:szCs w:val="22"/>
+        </w:rPr>
+        <w:t xml:space="preserve">_______________________________________________</w:t>
+      </w:r>
+    </w:p>
+    <w:p>
+      <w:pPr>
+        <w:spacing w:after="140" w:before="0"/>
+      </w:pPr>
+      <w:r>
+        <w:rPr>
+          <w:rFonts w:ascii="Arial" w:cs="Arial" w:eastAsia="Arial" w:hAnsi="Arial"/>
+          <w:color w:val="5A6B66"/>
+          <w:sz w:val="22"/>
+          <w:szCs w:val="22"/>
+        </w:rPr>
+        <w:t xml:space="preserve">NOME DO REPRESENTANTE LEGAL OU RESPONSÁVEL</w:t>
+      </w:r>
+    </w:p>
+    <w:p>
+      <w:pPr>
+        <w:spacing w:after="140" w:before="0"/>
+      </w:pPr>
+      <w:r>
+        <w:rPr>
+          <w:rFonts w:ascii="Arial" w:cs="Arial" w:eastAsia="Arial" w:hAnsi="Arial"/>
+          <w:color w:val="5A6B66"/>
+          <w:sz w:val="22"/>
+          <w:szCs w:val="22"/>
+        </w:rPr>
+        <w:t xml:space="preserve">RAZÃO SOCIAL OU NOME DO ESTABELECIMENTO</w:t>
+      </w:r>
+    </w:p>
+    <w:p>
+      <w:pPr>
+        <w:pBdr>
+          <w:bottom w:val="single" w:color="1A4A3A" w:sz="6"/>
+        </w:pBdr>
+        <w:spacing w:after="200" w:before="200"/>
+      </w:pPr>
     </w:p>
     <w:sectPr>
       <w:headerReference w:type="default" r:id="rId7"/>
@@ -5990,6 +6716,7 @@
     <w:rPrDefault>
       <w:rPr>
         <w:rFonts w:ascii="Arial" w:cs="Arial" w:eastAsia="Arial" w:hAnsi="Arial"/>
+        <w:color w:val="5A6B66"/>
         <w:sz w:val="22"/>
         <w:szCs w:val="22"/>
       </w:rPr>

</xml_diff>